<commit_message>
Module 9 : aide pour choisir la date du rendez-vous annuel
- Conclusions de module : texte d'aide optionnel sous l'intitulé (FR / EN).
- Module 9 : la question sur la date du rendez-vous annuel propose la
  Saint-Valentin, une date propre (rencontre, mariage…) ou dans un an, et
  rappelle la fenêtre de 6 mois à 1 an.
- Export Word des questions mis à jour.

Co-Authored-By: Claude Opus 5.5 <noreply@anthropic.com>
Claude-Session: https://claude.ai/code/session_01WUy2fZDbEVuyBbcnmkvWdH
</commit_message>
<xml_diff>
--- a/docs/YES-BOX-questions-FR-EN.docx
+++ b/docs/YES-BOX-questions-FR-EN.docx
@@ -13654,32 +13654,62 @@
               <w:spacing w:after="80"/>
             </w:pPr>
             <w:r>
-              <w:t xml:space="preserve">Notre rendez-vous annuel de couple : à quelle date aimerais-tu le fixer ? Votre anniversaire de couple ou dans 1 an ?</w:t>
-            </w:r>
-          </w:p>
-        </w:tc>
-        <w:tc>
-          <w:tcPr>
-            <w:tcW w:type="dxa" w:w="4559"/>
-            <w:tcBorders>
-              <w:top w:val="single" w:color="D9D2CA" w:sz="4"/>
-              <w:left w:val="single" w:color="D9D2CA" w:sz="4"/>
-              <w:bottom w:val="single" w:color="D9D2CA" w:sz="4"/>
-              <w:right w:val="single" w:color="D9D2CA" w:sz="4"/>
-            </w:tcBorders>
-            <w:tcMar>
-              <w:top w:type="dxa" w:w="80"/>
-              <w:left w:type="dxa" w:w="120"/>
-              <w:bottom w:type="dxa" w:w="80"/>
-              <w:right w:type="dxa" w:w="120"/>
-            </w:tcMar>
-          </w:tcPr>
-          <w:p>
-            <w:pPr>
-              <w:spacing w:after="80"/>
-            </w:pPr>
-            <w:r>
-              <w:t xml:space="preserve">Our yearly couple date: when would you like to set it? Your anniversary as a couple, or one year from now?</w:t>
+              <w:t xml:space="preserve">Notre rendez-vous annuel de couple : à quelle date aimerais-tu le fixer ?</w:t>
+            </w:r>
+          </w:p>
+          <w:p>
+            <w:pPr>
+              <w:spacing w:after="80"/>
+            </w:pPr>
+            <w:r>
+              <w:rPr>
+                <w:i/>
+                <w:iCs/>
+                <w:color w:val="736C63"/>
+                <w:sz w:val="19"/>
+                <w:szCs w:val="19"/>
+              </w:rPr>
+              <w:t xml:space="preserve">Vous pouvez par exemple opter pour une date internationale comme la Saint-Valentin. Vous pouvez aussi choisir une date qui vous appartient : un anniversaire de rencontre, de mariage… ou encore simplement vous donner rendez-vous dans un an. Attention à laisser au moins 6 mois (et au plus 1 an) entre la fin du programme et la date du rendez-vous annuel.</w:t>
+            </w:r>
+          </w:p>
+        </w:tc>
+        <w:tc>
+          <w:tcPr>
+            <w:tcW w:type="dxa" w:w="4559"/>
+            <w:tcBorders>
+              <w:top w:val="single" w:color="D9D2CA" w:sz="4"/>
+              <w:left w:val="single" w:color="D9D2CA" w:sz="4"/>
+              <w:bottom w:val="single" w:color="D9D2CA" w:sz="4"/>
+              <w:right w:val="single" w:color="D9D2CA" w:sz="4"/>
+            </w:tcBorders>
+            <w:tcMar>
+              <w:top w:type="dxa" w:w="80"/>
+              <w:left w:type="dxa" w:w="120"/>
+              <w:bottom w:type="dxa" w:w="80"/>
+              <w:right w:type="dxa" w:w="120"/>
+            </w:tcMar>
+          </w:tcPr>
+          <w:p>
+            <w:pPr>
+              <w:spacing w:after="80"/>
+            </w:pPr>
+            <w:r>
+              <w:t xml:space="preserve">Our yearly couple date: when would you like to set it?</w:t>
+            </w:r>
+          </w:p>
+          <w:p>
+            <w:pPr>
+              <w:spacing w:after="80"/>
+            </w:pPr>
+            <w:r>
+              <w:rPr>
+                <w:i/>
+                <w:iCs/>
+                <w:color w:val="736C63"/>
+                <w:sz w:val="19"/>
+                <w:szCs w:val="19"/>
+              </w:rPr>
+              <w:t xml:space="preserve">For example, you could choose an international date like Valentine's Day. You could also pick a date that belongs to you: the anniversary of when you met, your wedding anniversary… or simply arrange to meet again in one year. Make sure to leave at least 6 months (and at most 1 year) between the end of the program and your yearly date.</w:t>
             </w:r>
           </w:p>
         </w:tc>

</xml_diff>

<commit_message>
Module 8 : nouvelles questions, règles du jeu à cocher et questions de fin de module
- Textes des questions 1, 6 et 12 mis à jour, question sur la réception
  de la reformulation retirée
- Règles du jeu : choix multiple avec un champ libre « Autre »
- Retours à la ligne conservés dans le texte des questions
- Documents Word des questions mis à jour

Co-Authored-By: Claude Opus 5.5 <noreply@anthropic.com>
Claude-Session: https://claude.ai/code/session_01SShgmYMf83p9xfSEMNaRHR
</commit_message>
<xml_diff>
--- a/docs/YES-BOX-questions-FR-EN.docx
+++ b/docs/YES-BOX-questions-FR-EN.docx
@@ -10541,7 +10541,7 @@
         <w:pStyle w:val="Heading2"/>
       </w:pPr>
       <w:r>
-        <w:t xml:space="preserve">Questions (14)</w:t>
+        <w:t>Questions (13)</w:t>
       </w:r>
     </w:p>
     <w:tbl>
@@ -10684,57 +10684,57 @@
               <w:spacing w:after="80"/>
             </w:pPr>
             <w:r>
-              <w:t xml:space="preserve">1</w:t>
-            </w:r>
-          </w:p>
-        </w:tc>
-        <w:tc>
-          <w:tcPr>
-            <w:tcW w:type="dxa" w:w="4559"/>
-            <w:tcBorders>
-              <w:top w:val="single" w:color="D9D2CA" w:sz="4"/>
-              <w:left w:val="single" w:color="D9D2CA" w:sz="4"/>
-              <w:bottom w:val="single" w:color="D9D2CA" w:sz="4"/>
-              <w:right w:val="single" w:color="D9D2CA" w:sz="4"/>
-            </w:tcBorders>
-            <w:tcMar>
-              <w:top w:type="dxa" w:w="80"/>
-              <w:left w:type="dxa" w:w="120"/>
-              <w:bottom w:type="dxa" w:w="80"/>
-              <w:right w:type="dxa" w:w="120"/>
-            </w:tcMar>
-          </w:tcPr>
-          <w:p>
-            <w:pPr>
-              <w:spacing w:after="80"/>
-            </w:pPr>
-            <w:r>
-              <w:t xml:space="preserve">À propos de quoi vous disputez-vous le plus souvent : argent, tâches, belle-famille, temps, écrans, retards… ?</w:t>
-            </w:r>
-          </w:p>
-        </w:tc>
-        <w:tc>
-          <w:tcPr>
-            <w:tcW w:type="dxa" w:w="4559"/>
-            <w:tcBorders>
-              <w:top w:val="single" w:color="D9D2CA" w:sz="4"/>
-              <w:left w:val="single" w:color="D9D2CA" w:sz="4"/>
-              <w:bottom w:val="single" w:color="D9D2CA" w:sz="4"/>
-              <w:right w:val="single" w:color="D9D2CA" w:sz="4"/>
-            </w:tcBorders>
-            <w:tcMar>
-              <w:top w:type="dxa" w:w="80"/>
-              <w:left w:type="dxa" w:w="120"/>
-              <w:bottom w:type="dxa" w:w="80"/>
-              <w:right w:type="dxa" w:w="120"/>
-            </w:tcMar>
-          </w:tcPr>
-          <w:p>
-            <w:pPr>
-              <w:spacing w:after="80"/>
-            </w:pPr>
-            <w:r>
-              <w:t xml:space="preserve">What do you argue about most often: money, chores, in-laws, time, screens, lateness… ?</w:t>
+              <w:t>1</w:t>
+            </w:r>
+          </w:p>
+        </w:tc>
+        <w:tc>
+          <w:tcPr>
+            <w:tcW w:type="dxa" w:w="4559"/>
+            <w:tcBorders>
+              <w:top w:val="single" w:color="D9D2CA" w:sz="4"/>
+              <w:left w:val="single" w:color="D9D2CA" w:sz="4"/>
+              <w:bottom w:val="single" w:color="D9D2CA" w:sz="4"/>
+              <w:right w:val="single" w:color="D9D2CA" w:sz="4"/>
+            </w:tcBorders>
+            <w:tcMar>
+              <w:top w:type="dxa" w:w="80"/>
+              <w:left w:type="dxa" w:w="120"/>
+              <w:bottom w:type="dxa" w:w="80"/>
+              <w:right w:type="dxa" w:w="120"/>
+            </w:tcMar>
+          </w:tcPr>
+          <w:p>
+            <w:pPr>
+              <w:spacing w:after="80"/>
+            </w:pPr>
+            <w:r>
+              <w:t>À propos de quoi vous disputez-vous le plus souvent : argent, tâches, belle-famille, gestion du temps, écrans, retards ou autres ?</w:t>
+            </w:r>
+          </w:p>
+        </w:tc>
+        <w:tc>
+          <w:tcPr>
+            <w:tcW w:type="dxa" w:w="4559"/>
+            <w:tcBorders>
+              <w:top w:val="single" w:color="D9D2CA" w:sz="4"/>
+              <w:left w:val="single" w:color="D9D2CA" w:sz="4"/>
+              <w:bottom w:val="single" w:color="D9D2CA" w:sz="4"/>
+              <w:right w:val="single" w:color="D9D2CA" w:sz="4"/>
+            </w:tcBorders>
+            <w:tcMar>
+              <w:top w:type="dxa" w:w="80"/>
+              <w:left w:type="dxa" w:w="120"/>
+              <w:bottom w:type="dxa" w:w="80"/>
+              <w:right w:type="dxa" w:w="120"/>
+            </w:tcMar>
+          </w:tcPr>
+          <w:p>
+            <w:pPr>
+              <w:spacing w:after="80"/>
+            </w:pPr>
+            <w:r>
+              <w:t>What do you argue about most often: money, chores, in-laws, time management, screens, lateness or something else?</w:t>
             </w:r>
           </w:p>
         </w:tc>
@@ -10765,59 +10765,59 @@
               <w:spacing w:after="80"/>
             </w:pPr>
             <w:r>
-              <w:t xml:space="preserve">2</w:t>
-            </w:r>
-          </w:p>
-        </w:tc>
-        <w:tc>
-          <w:tcPr>
-            <w:tcW w:type="dxa" w:w="4559"/>
-            <w:tcBorders>
-              <w:top w:val="single" w:color="D9D2CA" w:sz="4"/>
-              <w:left w:val="single" w:color="D9D2CA" w:sz="4"/>
-              <w:bottom w:val="single" w:color="D9D2CA" w:sz="4"/>
-              <w:right w:val="single" w:color="D9D2CA" w:sz="4"/>
-            </w:tcBorders>
-            <w:shd w:fill="FBF8F3" w:color="auto" w:val="clear"/>
-            <w:tcMar>
-              <w:top w:type="dxa" w:w="80"/>
-              <w:left w:type="dxa" w:w="120"/>
-              <w:bottom w:type="dxa" w:w="80"/>
-              <w:right w:type="dxa" w:w="120"/>
-            </w:tcMar>
-          </w:tcPr>
-          <w:p>
-            <w:pPr>
-              <w:spacing w:after="80"/>
-            </w:pPr>
-            <w:r>
-              <w:t xml:space="preserve">Reprends les sujets évités ou les non-dits repérés au module 6 : lesquels finissent le plus souvent en dispute ?</w:t>
-            </w:r>
-          </w:p>
-        </w:tc>
-        <w:tc>
-          <w:tcPr>
-            <w:tcW w:type="dxa" w:w="4559"/>
-            <w:tcBorders>
-              <w:top w:val="single" w:color="D9D2CA" w:sz="4"/>
-              <w:left w:val="single" w:color="D9D2CA" w:sz="4"/>
-              <w:bottom w:val="single" w:color="D9D2CA" w:sz="4"/>
-              <w:right w:val="single" w:color="D9D2CA" w:sz="4"/>
-            </w:tcBorders>
-            <w:shd w:fill="FBF8F3" w:color="auto" w:val="clear"/>
-            <w:tcMar>
-              <w:top w:type="dxa" w:w="80"/>
-              <w:left w:type="dxa" w:w="120"/>
-              <w:bottom w:type="dxa" w:w="80"/>
-              <w:right w:type="dxa" w:w="120"/>
-            </w:tcMar>
-          </w:tcPr>
-          <w:p>
-            <w:pPr>
-              <w:spacing w:after="80"/>
-            </w:pPr>
-            <w:r>
-              <w:t xml:space="preserve">Go back to the avoided topics or unspoken issues you spotted in module 6: which ones most often end in an argument?</w:t>
+              <w:t>2</w:t>
+            </w:r>
+          </w:p>
+        </w:tc>
+        <w:tc>
+          <w:tcPr>
+            <w:tcW w:type="dxa" w:w="4559"/>
+            <w:tcBorders>
+              <w:top w:val="single" w:color="D9D2CA" w:sz="4"/>
+              <w:left w:val="single" w:color="D9D2CA" w:sz="4"/>
+              <w:bottom w:val="single" w:color="D9D2CA" w:sz="4"/>
+              <w:right w:val="single" w:color="D9D2CA" w:sz="4"/>
+            </w:tcBorders>
+            <w:shd w:fill="FBF8F3" w:color="auto" w:val="clear"/>
+            <w:tcMar>
+              <w:top w:type="dxa" w:w="80"/>
+              <w:left w:type="dxa" w:w="120"/>
+              <w:bottom w:type="dxa" w:w="80"/>
+              <w:right w:type="dxa" w:w="120"/>
+            </w:tcMar>
+          </w:tcPr>
+          <w:p>
+            <w:pPr>
+              <w:spacing w:after="80"/>
+            </w:pPr>
+            <w:r>
+              <w:t>Reprends les sujets évités ou les non-dits repérés au module 6 : lesquels finissent le plus souvent en dispute ?</w:t>
+            </w:r>
+          </w:p>
+        </w:tc>
+        <w:tc>
+          <w:tcPr>
+            <w:tcW w:type="dxa" w:w="4559"/>
+            <w:tcBorders>
+              <w:top w:val="single" w:color="D9D2CA" w:sz="4"/>
+              <w:left w:val="single" w:color="D9D2CA" w:sz="4"/>
+              <w:bottom w:val="single" w:color="D9D2CA" w:sz="4"/>
+              <w:right w:val="single" w:color="D9D2CA" w:sz="4"/>
+            </w:tcBorders>
+            <w:shd w:fill="FBF8F3" w:color="auto" w:val="clear"/>
+            <w:tcMar>
+              <w:top w:type="dxa" w:w="80"/>
+              <w:left w:type="dxa" w:w="120"/>
+              <w:bottom w:type="dxa" w:w="80"/>
+              <w:right w:type="dxa" w:w="120"/>
+            </w:tcMar>
+          </w:tcPr>
+          <w:p>
+            <w:pPr>
+              <w:spacing w:after="80"/>
+            </w:pPr>
+            <w:r>
+              <w:t>Go back to the avoided topics or unspoken issues you spotted in module 6: which ones most often end in an argument?</w:t>
             </w:r>
           </w:p>
         </w:tc>
@@ -10847,57 +10847,57 @@
               <w:spacing w:after="80"/>
             </w:pPr>
             <w:r>
-              <w:t xml:space="preserve">3</w:t>
-            </w:r>
-          </w:p>
-        </w:tc>
-        <w:tc>
-          <w:tcPr>
-            <w:tcW w:type="dxa" w:w="4559"/>
-            <w:tcBorders>
-              <w:top w:val="single" w:color="D9D2CA" w:sz="4"/>
-              <w:left w:val="single" w:color="D9D2CA" w:sz="4"/>
-              <w:bottom w:val="single" w:color="D9D2CA" w:sz="4"/>
-              <w:right w:val="single" w:color="D9D2CA" w:sz="4"/>
-            </w:tcBorders>
-            <w:tcMar>
-              <w:top w:type="dxa" w:w="80"/>
-              <w:left w:type="dxa" w:w="120"/>
-              <w:bottom w:type="dxa" w:w="80"/>
-              <w:right w:type="dxa" w:w="120"/>
-            </w:tcMar>
-          </w:tcPr>
-          <w:p>
-            <w:pPr>
-              <w:spacing w:after="80"/>
-            </w:pPr>
-            <w:r>
-              <w:t xml:space="preserve">Quels sont tes déclencheurs : un mot, un ton, un moment de la journée, la fatigue… la faim ?</w:t>
-            </w:r>
-          </w:p>
-        </w:tc>
-        <w:tc>
-          <w:tcPr>
-            <w:tcW w:type="dxa" w:w="4559"/>
-            <w:tcBorders>
-              <w:top w:val="single" w:color="D9D2CA" w:sz="4"/>
-              <w:left w:val="single" w:color="D9D2CA" w:sz="4"/>
-              <w:bottom w:val="single" w:color="D9D2CA" w:sz="4"/>
-              <w:right w:val="single" w:color="D9D2CA" w:sz="4"/>
-            </w:tcBorders>
-            <w:tcMar>
-              <w:top w:type="dxa" w:w="80"/>
-              <w:left w:type="dxa" w:w="120"/>
-              <w:bottom w:type="dxa" w:w="80"/>
-              <w:right w:type="dxa" w:w="120"/>
-            </w:tcMar>
-          </w:tcPr>
-          <w:p>
-            <w:pPr>
-              <w:spacing w:after="80"/>
-            </w:pPr>
-            <w:r>
-              <w:t xml:space="preserve">What are your triggers: a word, a tone, a time of day, tiredness… hunger?</w:t>
+              <w:t>3</w:t>
+            </w:r>
+          </w:p>
+        </w:tc>
+        <w:tc>
+          <w:tcPr>
+            <w:tcW w:type="dxa" w:w="4559"/>
+            <w:tcBorders>
+              <w:top w:val="single" w:color="D9D2CA" w:sz="4"/>
+              <w:left w:val="single" w:color="D9D2CA" w:sz="4"/>
+              <w:bottom w:val="single" w:color="D9D2CA" w:sz="4"/>
+              <w:right w:val="single" w:color="D9D2CA" w:sz="4"/>
+            </w:tcBorders>
+            <w:tcMar>
+              <w:top w:type="dxa" w:w="80"/>
+              <w:left w:type="dxa" w:w="120"/>
+              <w:bottom w:type="dxa" w:w="80"/>
+              <w:right w:type="dxa" w:w="120"/>
+            </w:tcMar>
+          </w:tcPr>
+          <w:p>
+            <w:pPr>
+              <w:spacing w:after="80"/>
+            </w:pPr>
+            <w:r>
+              <w:t>Quels sont tes déclencheurs : un mot, un ton, un moment de la journée, la fatigue… la faim ?</w:t>
+            </w:r>
+          </w:p>
+        </w:tc>
+        <w:tc>
+          <w:tcPr>
+            <w:tcW w:type="dxa" w:w="4559"/>
+            <w:tcBorders>
+              <w:top w:val="single" w:color="D9D2CA" w:sz="4"/>
+              <w:left w:val="single" w:color="D9D2CA" w:sz="4"/>
+              <w:bottom w:val="single" w:color="D9D2CA" w:sz="4"/>
+              <w:right w:val="single" w:color="D9D2CA" w:sz="4"/>
+            </w:tcBorders>
+            <w:tcMar>
+              <w:top w:type="dxa" w:w="80"/>
+              <w:left w:type="dxa" w:w="120"/>
+              <w:bottom w:type="dxa" w:w="80"/>
+              <w:right w:type="dxa" w:w="120"/>
+            </w:tcMar>
+          </w:tcPr>
+          <w:p>
+            <w:pPr>
+              <w:spacing w:after="80"/>
+            </w:pPr>
+            <w:r>
+              <w:t>What are your triggers: a word, a tone, a time of day, tiredness… hunger?</w:t>
             </w:r>
           </w:p>
         </w:tc>
@@ -10928,59 +10928,59 @@
               <w:spacing w:after="80"/>
             </w:pPr>
             <w:r>
-              <w:t xml:space="preserve">4</w:t>
-            </w:r>
-          </w:p>
-        </w:tc>
-        <w:tc>
-          <w:tcPr>
-            <w:tcW w:type="dxa" w:w="4559"/>
-            <w:tcBorders>
-              <w:top w:val="single" w:color="D9D2CA" w:sz="4"/>
-              <w:left w:val="single" w:color="D9D2CA" w:sz="4"/>
-              <w:bottom w:val="single" w:color="D9D2CA" w:sz="4"/>
-              <w:right w:val="single" w:color="D9D2CA" w:sz="4"/>
-            </w:tcBorders>
-            <w:shd w:fill="FBF8F3" w:color="auto" w:val="clear"/>
-            <w:tcMar>
-              <w:top w:type="dxa" w:w="80"/>
-              <w:left w:type="dxa" w:w="120"/>
-              <w:bottom w:type="dxa" w:w="80"/>
-              <w:right w:type="dxa" w:w="120"/>
-            </w:tcMar>
-          </w:tcPr>
-          <w:p>
-            <w:pPr>
-              <w:spacing w:after="80"/>
-            </w:pPr>
-            <w:r>
-              <w:t xml:space="preserve">En dispute, quelle image te ressemble le plus : volcan, iceberg, salle d'audience, porte qui claque, table de négociation ?</w:t>
-            </w:r>
-          </w:p>
-        </w:tc>
-        <w:tc>
-          <w:tcPr>
-            <w:tcW w:type="dxa" w:w="4559"/>
-            <w:tcBorders>
-              <w:top w:val="single" w:color="D9D2CA" w:sz="4"/>
-              <w:left w:val="single" w:color="D9D2CA" w:sz="4"/>
-              <w:bottom w:val="single" w:color="D9D2CA" w:sz="4"/>
-              <w:right w:val="single" w:color="D9D2CA" w:sz="4"/>
-            </w:tcBorders>
-            <w:shd w:fill="FBF8F3" w:color="auto" w:val="clear"/>
-            <w:tcMar>
-              <w:top w:type="dxa" w:w="80"/>
-              <w:left w:type="dxa" w:w="120"/>
-              <w:bottom w:type="dxa" w:w="80"/>
-              <w:right w:type="dxa" w:w="120"/>
-            </w:tcMar>
-          </w:tcPr>
-          <w:p>
-            <w:pPr>
-              <w:spacing w:after="80"/>
-            </w:pPr>
-            <w:r>
-              <w:t xml:space="preserve">In an argument, which image fits you best: volcano, iceberg, courtroom, slamming door, negotiating table?</w:t>
+              <w:t>4</w:t>
+            </w:r>
+          </w:p>
+        </w:tc>
+        <w:tc>
+          <w:tcPr>
+            <w:tcW w:type="dxa" w:w="4559"/>
+            <w:tcBorders>
+              <w:top w:val="single" w:color="D9D2CA" w:sz="4"/>
+              <w:left w:val="single" w:color="D9D2CA" w:sz="4"/>
+              <w:bottom w:val="single" w:color="D9D2CA" w:sz="4"/>
+              <w:right w:val="single" w:color="D9D2CA" w:sz="4"/>
+            </w:tcBorders>
+            <w:shd w:fill="FBF8F3" w:color="auto" w:val="clear"/>
+            <w:tcMar>
+              <w:top w:type="dxa" w:w="80"/>
+              <w:left w:type="dxa" w:w="120"/>
+              <w:bottom w:type="dxa" w:w="80"/>
+              <w:right w:type="dxa" w:w="120"/>
+            </w:tcMar>
+          </w:tcPr>
+          <w:p>
+            <w:pPr>
+              <w:spacing w:after="80"/>
+            </w:pPr>
+            <w:r>
+              <w:t>En dispute, quelle image te ressemble le plus : volcan, iceberg, salle d'audience, porte qui claque, table de négociation ?</w:t>
+            </w:r>
+          </w:p>
+        </w:tc>
+        <w:tc>
+          <w:tcPr>
+            <w:tcW w:type="dxa" w:w="4559"/>
+            <w:tcBorders>
+              <w:top w:val="single" w:color="D9D2CA" w:sz="4"/>
+              <w:left w:val="single" w:color="D9D2CA" w:sz="4"/>
+              <w:bottom w:val="single" w:color="D9D2CA" w:sz="4"/>
+              <w:right w:val="single" w:color="D9D2CA" w:sz="4"/>
+            </w:tcBorders>
+            <w:shd w:fill="FBF8F3" w:color="auto" w:val="clear"/>
+            <w:tcMar>
+              <w:top w:type="dxa" w:w="80"/>
+              <w:left w:type="dxa" w:w="120"/>
+              <w:bottom w:type="dxa" w:w="80"/>
+              <w:right w:type="dxa" w:w="120"/>
+            </w:tcMar>
+          </w:tcPr>
+          <w:p>
+            <w:pPr>
+              <w:spacing w:after="80"/>
+            </w:pPr>
+            <w:r>
+              <w:t>In an argument, which image fits you best: volcano, iceberg, courtroom, slamming door, negotiating table?</w:t>
             </w:r>
           </w:p>
         </w:tc>
@@ -11010,57 +11010,57 @@
               <w:spacing w:after="80"/>
             </w:pPr>
             <w:r>
-              <w:t xml:space="preserve">5</w:t>
-            </w:r>
-          </w:p>
-        </w:tc>
-        <w:tc>
-          <w:tcPr>
-            <w:tcW w:type="dxa" w:w="4559"/>
-            <w:tcBorders>
-              <w:top w:val="single" w:color="D9D2CA" w:sz="4"/>
-              <w:left w:val="single" w:color="D9D2CA" w:sz="4"/>
-              <w:bottom w:val="single" w:color="D9D2CA" w:sz="4"/>
-              <w:right w:val="single" w:color="D9D2CA" w:sz="4"/>
-            </w:tcBorders>
-            <w:tcMar>
-              <w:top w:type="dxa" w:w="80"/>
-              <w:left w:type="dxa" w:w="120"/>
-              <w:bottom w:type="dxa" w:w="80"/>
-              <w:right w:type="dxa" w:w="120"/>
-            </w:tcMar>
-          </w:tcPr>
-          <w:p>
-            <w:pPr>
-              <w:spacing w:after="80"/>
-            </w:pPr>
-            <w:r>
-              <w:t xml:space="preserve">Pendant une dispute, qu'est-ce qui est le plus difficile à encaisser pour toi ?</w:t>
-            </w:r>
-          </w:p>
-        </w:tc>
-        <w:tc>
-          <w:tcPr>
-            <w:tcW w:type="dxa" w:w="4559"/>
-            <w:tcBorders>
-              <w:top w:val="single" w:color="D9D2CA" w:sz="4"/>
-              <w:left w:val="single" w:color="D9D2CA" w:sz="4"/>
-              <w:bottom w:val="single" w:color="D9D2CA" w:sz="4"/>
-              <w:right w:val="single" w:color="D9D2CA" w:sz="4"/>
-            </w:tcBorders>
-            <w:tcMar>
-              <w:top w:type="dxa" w:w="80"/>
-              <w:left w:type="dxa" w:w="120"/>
-              <w:bottom w:type="dxa" w:w="80"/>
-              <w:right w:type="dxa" w:w="120"/>
-            </w:tcMar>
-          </w:tcPr>
-          <w:p>
-            <w:pPr>
-              <w:spacing w:after="80"/>
-            </w:pPr>
-            <w:r>
-              <w:t xml:space="preserve">During an argument, what is hardest for you to take?</w:t>
+              <w:t>5</w:t>
+            </w:r>
+          </w:p>
+        </w:tc>
+        <w:tc>
+          <w:tcPr>
+            <w:tcW w:type="dxa" w:w="4559"/>
+            <w:tcBorders>
+              <w:top w:val="single" w:color="D9D2CA" w:sz="4"/>
+              <w:left w:val="single" w:color="D9D2CA" w:sz="4"/>
+              <w:bottom w:val="single" w:color="D9D2CA" w:sz="4"/>
+              <w:right w:val="single" w:color="D9D2CA" w:sz="4"/>
+            </w:tcBorders>
+            <w:tcMar>
+              <w:top w:type="dxa" w:w="80"/>
+              <w:left w:type="dxa" w:w="120"/>
+              <w:bottom w:type="dxa" w:w="80"/>
+              <w:right w:type="dxa" w:w="120"/>
+            </w:tcMar>
+          </w:tcPr>
+          <w:p>
+            <w:pPr>
+              <w:spacing w:after="80"/>
+            </w:pPr>
+            <w:r>
+              <w:t>Pendant une dispute, qu'est-ce qui est le plus difficile à encaisser pour toi ?</w:t>
+            </w:r>
+          </w:p>
+        </w:tc>
+        <w:tc>
+          <w:tcPr>
+            <w:tcW w:type="dxa" w:w="4559"/>
+            <w:tcBorders>
+              <w:top w:val="single" w:color="D9D2CA" w:sz="4"/>
+              <w:left w:val="single" w:color="D9D2CA" w:sz="4"/>
+              <w:bottom w:val="single" w:color="D9D2CA" w:sz="4"/>
+              <w:right w:val="single" w:color="D9D2CA" w:sz="4"/>
+            </w:tcBorders>
+            <w:tcMar>
+              <w:top w:type="dxa" w:w="80"/>
+              <w:left w:type="dxa" w:w="120"/>
+              <w:bottom w:type="dxa" w:w="80"/>
+              <w:right w:type="dxa" w:w="120"/>
+            </w:tcMar>
+          </w:tcPr>
+          <w:p>
+            <w:pPr>
+              <w:spacing w:after="80"/>
+            </w:pPr>
+            <w:r>
+              <w:t>During an argument, what is hardest for you to take?</w:t>
             </w:r>
           </w:p>
         </w:tc>
@@ -11091,59 +11091,59 @@
               <w:spacing w:after="80"/>
             </w:pPr>
             <w:r>
-              <w:t xml:space="preserve">6</w:t>
-            </w:r>
-          </w:p>
-        </w:tc>
-        <w:tc>
-          <w:tcPr>
-            <w:tcW w:type="dxa" w:w="4559"/>
-            <w:tcBorders>
-              <w:top w:val="single" w:color="D9D2CA" w:sz="4"/>
-              <w:left w:val="single" w:color="D9D2CA" w:sz="4"/>
-              <w:bottom w:val="single" w:color="D9D2CA" w:sz="4"/>
-              <w:right w:val="single" w:color="D9D2CA" w:sz="4"/>
-            </w:tcBorders>
-            <w:shd w:fill="FBF8F3" w:color="auto" w:val="clear"/>
-            <w:tcMar>
-              <w:top w:type="dxa" w:w="80"/>
-              <w:left w:type="dxa" w:w="120"/>
-              <w:bottom w:type="dxa" w:w="80"/>
-              <w:right w:type="dxa" w:w="120"/>
-            </w:tcMar>
-          </w:tcPr>
-          <w:p>
-            <w:pPr>
-              <w:spacing w:after="80"/>
-            </w:pPr>
-            <w:r>
-              <w:t xml:space="preserve">Qu'est-ce que tu fais ou dis qui, tu le sais, envenime les choses ?</w:t>
-            </w:r>
-          </w:p>
-        </w:tc>
-        <w:tc>
-          <w:tcPr>
-            <w:tcW w:type="dxa" w:w="4559"/>
-            <w:tcBorders>
-              <w:top w:val="single" w:color="D9D2CA" w:sz="4"/>
-              <w:left w:val="single" w:color="D9D2CA" w:sz="4"/>
-              <w:bottom w:val="single" w:color="D9D2CA" w:sz="4"/>
-              <w:right w:val="single" w:color="D9D2CA" w:sz="4"/>
-            </w:tcBorders>
-            <w:shd w:fill="FBF8F3" w:color="auto" w:val="clear"/>
-            <w:tcMar>
-              <w:top w:type="dxa" w:w="80"/>
-              <w:left w:type="dxa" w:w="120"/>
-              <w:bottom w:type="dxa" w:w="80"/>
-              <w:right w:type="dxa" w:w="120"/>
-            </w:tcMar>
-          </w:tcPr>
-          <w:p>
-            <w:pPr>
-              <w:spacing w:after="80"/>
-            </w:pPr>
-            <w:r>
-              <w:t xml:space="preserve">What do you do or say that, you know, makes things worse?</w:t>
+              <w:t>6</w:t>
+            </w:r>
+          </w:p>
+        </w:tc>
+        <w:tc>
+          <w:tcPr>
+            <w:tcW w:type="dxa" w:w="4559"/>
+            <w:tcBorders>
+              <w:top w:val="single" w:color="D9D2CA" w:sz="4"/>
+              <w:left w:val="single" w:color="D9D2CA" w:sz="4"/>
+              <w:bottom w:val="single" w:color="D9D2CA" w:sz="4"/>
+              <w:right w:val="single" w:color="D9D2CA" w:sz="4"/>
+            </w:tcBorders>
+            <w:shd w:fill="FBF8F3" w:color="auto" w:val="clear"/>
+            <w:tcMar>
+              <w:top w:type="dxa" w:w="80"/>
+              <w:left w:type="dxa" w:w="120"/>
+              <w:bottom w:type="dxa" w:w="80"/>
+              <w:right w:type="dxa" w:w="120"/>
+            </w:tcMar>
+          </w:tcPr>
+          <w:p>
+            <w:pPr>
+              <w:spacing w:after="80"/>
+            </w:pPr>
+            <w:r>
+              <w:t>Qu'est-ce que tu fais ou dis qui envenime les choses (et tu le sais) ?</w:t>
+            </w:r>
+          </w:p>
+        </w:tc>
+        <w:tc>
+          <w:tcPr>
+            <w:tcW w:type="dxa" w:w="4559"/>
+            <w:tcBorders>
+              <w:top w:val="single" w:color="D9D2CA" w:sz="4"/>
+              <w:left w:val="single" w:color="D9D2CA" w:sz="4"/>
+              <w:bottom w:val="single" w:color="D9D2CA" w:sz="4"/>
+              <w:right w:val="single" w:color="D9D2CA" w:sz="4"/>
+            </w:tcBorders>
+            <w:shd w:fill="FBF8F3" w:color="auto" w:val="clear"/>
+            <w:tcMar>
+              <w:top w:type="dxa" w:w="80"/>
+              <w:left w:type="dxa" w:w="120"/>
+              <w:bottom w:type="dxa" w:w="80"/>
+              <w:right w:type="dxa" w:w="120"/>
+            </w:tcMar>
+          </w:tcPr>
+          <w:p>
+            <w:pPr>
+              <w:spacing w:after="80"/>
+            </w:pPr>
+            <w:r>
+              <w:t>What do you do or say that makes things worse (and you know it)?</w:t>
             </w:r>
           </w:p>
         </w:tc>
@@ -11173,57 +11173,57 @@
               <w:spacing w:after="80"/>
             </w:pPr>
             <w:r>
-              <w:t xml:space="preserve">7</w:t>
-            </w:r>
-          </w:p>
-        </w:tc>
-        <w:tc>
-          <w:tcPr>
-            <w:tcW w:type="dxa" w:w="4559"/>
-            <w:tcBorders>
-              <w:top w:val="single" w:color="D9D2CA" w:sz="4"/>
-              <w:left w:val="single" w:color="D9D2CA" w:sz="4"/>
-              <w:bottom w:val="single" w:color="D9D2CA" w:sz="4"/>
-              <w:right w:val="single" w:color="D9D2CA" w:sz="4"/>
-            </w:tcBorders>
-            <w:tcMar>
-              <w:top w:type="dxa" w:w="80"/>
-              <w:left w:type="dxa" w:w="120"/>
-              <w:bottom w:type="dxa" w:w="80"/>
-              <w:right w:type="dxa" w:w="120"/>
-            </w:tcMar>
-          </w:tcPr>
-          <w:p>
-            <w:pPr>
-              <w:spacing w:after="80"/>
-            </w:pPr>
-            <w:r>
-              <w:t xml:space="preserve">Et pendant une dispute, sais-tu ce qui calme l'autre ?</w:t>
-            </w:r>
-          </w:p>
-        </w:tc>
-        <w:tc>
-          <w:tcPr>
-            <w:tcW w:type="dxa" w:w="4559"/>
-            <w:tcBorders>
-              <w:top w:val="single" w:color="D9D2CA" w:sz="4"/>
-              <w:left w:val="single" w:color="D9D2CA" w:sz="4"/>
-              <w:bottom w:val="single" w:color="D9D2CA" w:sz="4"/>
-              <w:right w:val="single" w:color="D9D2CA" w:sz="4"/>
-            </w:tcBorders>
-            <w:tcMar>
-              <w:top w:type="dxa" w:w="80"/>
-              <w:left w:type="dxa" w:w="120"/>
-              <w:bottom w:type="dxa" w:w="80"/>
-              <w:right w:type="dxa" w:w="120"/>
-            </w:tcMar>
-          </w:tcPr>
-          <w:p>
-            <w:pPr>
-              <w:spacing w:after="80"/>
-            </w:pPr>
-            <w:r>
-              <w:t xml:space="preserve">And during an argument, do you know what calms your partner down?</w:t>
+              <w:t>7</w:t>
+            </w:r>
+          </w:p>
+        </w:tc>
+        <w:tc>
+          <w:tcPr>
+            <w:tcW w:type="dxa" w:w="4559"/>
+            <w:tcBorders>
+              <w:top w:val="single" w:color="D9D2CA" w:sz="4"/>
+              <w:left w:val="single" w:color="D9D2CA" w:sz="4"/>
+              <w:bottom w:val="single" w:color="D9D2CA" w:sz="4"/>
+              <w:right w:val="single" w:color="D9D2CA" w:sz="4"/>
+            </w:tcBorders>
+            <w:tcMar>
+              <w:top w:type="dxa" w:w="80"/>
+              <w:left w:type="dxa" w:w="120"/>
+              <w:bottom w:type="dxa" w:w="80"/>
+              <w:right w:type="dxa" w:w="120"/>
+            </w:tcMar>
+          </w:tcPr>
+          <w:p>
+            <w:pPr>
+              <w:spacing w:after="80"/>
+            </w:pPr>
+            <w:r>
+              <w:t>Et pendant une dispute, sais-tu ce qui calme l'autre ?</w:t>
+            </w:r>
+          </w:p>
+        </w:tc>
+        <w:tc>
+          <w:tcPr>
+            <w:tcW w:type="dxa" w:w="4559"/>
+            <w:tcBorders>
+              <w:top w:val="single" w:color="D9D2CA" w:sz="4"/>
+              <w:left w:val="single" w:color="D9D2CA" w:sz="4"/>
+              <w:bottom w:val="single" w:color="D9D2CA" w:sz="4"/>
+              <w:right w:val="single" w:color="D9D2CA" w:sz="4"/>
+            </w:tcBorders>
+            <w:tcMar>
+              <w:top w:type="dxa" w:w="80"/>
+              <w:left w:type="dxa" w:w="120"/>
+              <w:bottom w:type="dxa" w:w="80"/>
+              <w:right w:type="dxa" w:w="120"/>
+            </w:tcMar>
+          </w:tcPr>
+          <w:p>
+            <w:pPr>
+              <w:spacing w:after="80"/>
+            </w:pPr>
+            <w:r>
+              <w:t>And during an argument, do you know what calms your partner down?</w:t>
             </w:r>
           </w:p>
         </w:tc>
@@ -11254,59 +11254,59 @@
               <w:spacing w:after="80"/>
             </w:pPr>
             <w:r>
-              <w:t xml:space="preserve">8</w:t>
-            </w:r>
-          </w:p>
-        </w:tc>
-        <w:tc>
-          <w:tcPr>
-            <w:tcW w:type="dxa" w:w="4559"/>
-            <w:tcBorders>
-              <w:top w:val="single" w:color="D9D2CA" w:sz="4"/>
-              <w:left w:val="single" w:color="D9D2CA" w:sz="4"/>
-              <w:bottom w:val="single" w:color="D9D2CA" w:sz="4"/>
-              <w:right w:val="single" w:color="D9D2CA" w:sz="4"/>
-            </w:tcBorders>
-            <w:shd w:fill="FBF8F3" w:color="auto" w:val="clear"/>
-            <w:tcMar>
-              <w:top w:type="dxa" w:w="80"/>
-              <w:left w:type="dxa" w:w="120"/>
-              <w:bottom w:type="dxa" w:w="80"/>
-              <w:right w:type="dxa" w:w="120"/>
-            </w:tcMar>
-          </w:tcPr>
-          <w:p>
-            <w:pPr>
-              <w:spacing w:after="80"/>
-            </w:pPr>
-            <w:r>
-              <w:t xml:space="preserve">Comment se termine une dispute chez vous, la plupart du temps ?</w:t>
-            </w:r>
-          </w:p>
-        </w:tc>
-        <w:tc>
-          <w:tcPr>
-            <w:tcW w:type="dxa" w:w="4559"/>
-            <w:tcBorders>
-              <w:top w:val="single" w:color="D9D2CA" w:sz="4"/>
-              <w:left w:val="single" w:color="D9D2CA" w:sz="4"/>
-              <w:bottom w:val="single" w:color="D9D2CA" w:sz="4"/>
-              <w:right w:val="single" w:color="D9D2CA" w:sz="4"/>
-            </w:tcBorders>
-            <w:shd w:fill="FBF8F3" w:color="auto" w:val="clear"/>
-            <w:tcMar>
-              <w:top w:type="dxa" w:w="80"/>
-              <w:left w:type="dxa" w:w="120"/>
-              <w:bottom w:type="dxa" w:w="80"/>
-              <w:right w:type="dxa" w:w="120"/>
-            </w:tcMar>
-          </w:tcPr>
-          <w:p>
-            <w:pPr>
-              <w:spacing w:after="80"/>
-            </w:pPr>
-            <w:r>
-              <w:t xml:space="preserve">How does an argument usually end between you?</w:t>
+              <w:t>8</w:t>
+            </w:r>
+          </w:p>
+        </w:tc>
+        <w:tc>
+          <w:tcPr>
+            <w:tcW w:type="dxa" w:w="4559"/>
+            <w:tcBorders>
+              <w:top w:val="single" w:color="D9D2CA" w:sz="4"/>
+              <w:left w:val="single" w:color="D9D2CA" w:sz="4"/>
+              <w:bottom w:val="single" w:color="D9D2CA" w:sz="4"/>
+              <w:right w:val="single" w:color="D9D2CA" w:sz="4"/>
+            </w:tcBorders>
+            <w:shd w:fill="FBF8F3" w:color="auto" w:val="clear"/>
+            <w:tcMar>
+              <w:top w:type="dxa" w:w="80"/>
+              <w:left w:type="dxa" w:w="120"/>
+              <w:bottom w:type="dxa" w:w="80"/>
+              <w:right w:type="dxa" w:w="120"/>
+            </w:tcMar>
+          </w:tcPr>
+          <w:p>
+            <w:pPr>
+              <w:spacing w:after="80"/>
+            </w:pPr>
+            <w:r>
+              <w:t>Comment se termine une dispute chez vous, la plupart du temps ?</w:t>
+            </w:r>
+          </w:p>
+        </w:tc>
+        <w:tc>
+          <w:tcPr>
+            <w:tcW w:type="dxa" w:w="4559"/>
+            <w:tcBorders>
+              <w:top w:val="single" w:color="D9D2CA" w:sz="4"/>
+              <w:left w:val="single" w:color="D9D2CA" w:sz="4"/>
+              <w:bottom w:val="single" w:color="D9D2CA" w:sz="4"/>
+              <w:right w:val="single" w:color="D9D2CA" w:sz="4"/>
+            </w:tcBorders>
+            <w:shd w:fill="FBF8F3" w:color="auto" w:val="clear"/>
+            <w:tcMar>
+              <w:top w:type="dxa" w:w="80"/>
+              <w:left w:type="dxa" w:w="120"/>
+              <w:bottom w:type="dxa" w:w="80"/>
+              <w:right w:type="dxa" w:w="120"/>
+            </w:tcMar>
+          </w:tcPr>
+          <w:p>
+            <w:pPr>
+              <w:spacing w:after="80"/>
+            </w:pPr>
+            <w:r>
+              <w:t>How does an argument usually end between you?</w:t>
             </w:r>
           </w:p>
         </w:tc>
@@ -11336,57 +11336,57 @@
               <w:spacing w:after="80"/>
             </w:pPr>
             <w:r>
-              <w:t xml:space="preserve">9</w:t>
-            </w:r>
-          </w:p>
-        </w:tc>
-        <w:tc>
-          <w:tcPr>
-            <w:tcW w:type="dxa" w:w="4559"/>
-            <w:tcBorders>
-              <w:top w:val="single" w:color="D9D2CA" w:sz="4"/>
-              <w:left w:val="single" w:color="D9D2CA" w:sz="4"/>
-              <w:bottom w:val="single" w:color="D9D2CA" w:sz="4"/>
-              <w:right w:val="single" w:color="D9D2CA" w:sz="4"/>
-            </w:tcBorders>
-            <w:tcMar>
-              <w:top w:type="dxa" w:w="80"/>
-              <w:left w:type="dxa" w:w="120"/>
-              <w:bottom w:type="dxa" w:w="80"/>
-              <w:right w:type="dxa" w:w="120"/>
-            </w:tcMar>
-          </w:tcPr>
-          <w:p>
-            <w:pPr>
-              <w:spacing w:after="80"/>
-            </w:pPr>
-            <w:r>
-              <w:t xml:space="preserve">Qui fait le premier pas vers la réconciliation ? Et comment ?</w:t>
-            </w:r>
-          </w:p>
-        </w:tc>
-        <w:tc>
-          <w:tcPr>
-            <w:tcW w:type="dxa" w:w="4559"/>
-            <w:tcBorders>
-              <w:top w:val="single" w:color="D9D2CA" w:sz="4"/>
-              <w:left w:val="single" w:color="D9D2CA" w:sz="4"/>
-              <w:bottom w:val="single" w:color="D9D2CA" w:sz="4"/>
-              <w:right w:val="single" w:color="D9D2CA" w:sz="4"/>
-            </w:tcBorders>
-            <w:tcMar>
-              <w:top w:type="dxa" w:w="80"/>
-              <w:left w:type="dxa" w:w="120"/>
-              <w:bottom w:type="dxa" w:w="80"/>
-              <w:right w:type="dxa" w:w="120"/>
-            </w:tcMar>
-          </w:tcPr>
-          <w:p>
-            <w:pPr>
-              <w:spacing w:after="80"/>
-            </w:pPr>
-            <w:r>
-              <w:t xml:space="preserve">Who takes the first step toward making up? And how?</w:t>
+              <w:t>9</w:t>
+            </w:r>
+          </w:p>
+        </w:tc>
+        <w:tc>
+          <w:tcPr>
+            <w:tcW w:type="dxa" w:w="4559"/>
+            <w:tcBorders>
+              <w:top w:val="single" w:color="D9D2CA" w:sz="4"/>
+              <w:left w:val="single" w:color="D9D2CA" w:sz="4"/>
+              <w:bottom w:val="single" w:color="D9D2CA" w:sz="4"/>
+              <w:right w:val="single" w:color="D9D2CA" w:sz="4"/>
+            </w:tcBorders>
+            <w:tcMar>
+              <w:top w:type="dxa" w:w="80"/>
+              <w:left w:type="dxa" w:w="120"/>
+              <w:bottom w:type="dxa" w:w="80"/>
+              <w:right w:type="dxa" w:w="120"/>
+            </w:tcMar>
+          </w:tcPr>
+          <w:p>
+            <w:pPr>
+              <w:spacing w:after="80"/>
+            </w:pPr>
+            <w:r>
+              <w:t>Qui fait le premier pas vers la réconciliation ? Et comment ?</w:t>
+            </w:r>
+          </w:p>
+        </w:tc>
+        <w:tc>
+          <w:tcPr>
+            <w:tcW w:type="dxa" w:w="4559"/>
+            <w:tcBorders>
+              <w:top w:val="single" w:color="D9D2CA" w:sz="4"/>
+              <w:left w:val="single" w:color="D9D2CA" w:sz="4"/>
+              <w:bottom w:val="single" w:color="D9D2CA" w:sz="4"/>
+              <w:right w:val="single" w:color="D9D2CA" w:sz="4"/>
+            </w:tcBorders>
+            <w:tcMar>
+              <w:top w:type="dxa" w:w="80"/>
+              <w:left w:type="dxa" w:w="120"/>
+              <w:bottom w:type="dxa" w:w="80"/>
+              <w:right w:type="dxa" w:w="120"/>
+            </w:tcMar>
+          </w:tcPr>
+          <w:p>
+            <w:pPr>
+              <w:spacing w:after="80"/>
+            </w:pPr>
+            <w:r>
+              <w:t>Who takes the first step toward making up? And how?</w:t>
             </w:r>
           </w:p>
         </w:tc>
@@ -11417,59 +11417,59 @@
               <w:spacing w:after="80"/>
             </w:pPr>
             <w:r>
-              <w:t xml:space="preserve">10</w:t>
-            </w:r>
-          </w:p>
-        </w:tc>
-        <w:tc>
-          <w:tcPr>
-            <w:tcW w:type="dxa" w:w="4559"/>
-            <w:tcBorders>
-              <w:top w:val="single" w:color="D9D2CA" w:sz="4"/>
-              <w:left w:val="single" w:color="D9D2CA" w:sz="4"/>
-              <w:bottom w:val="single" w:color="D9D2CA" w:sz="4"/>
-              <w:right w:val="single" w:color="D9D2CA" w:sz="4"/>
-            </w:tcBorders>
-            <w:shd w:fill="FBF8F3" w:color="auto" w:val="clear"/>
-            <w:tcMar>
-              <w:top w:type="dxa" w:w="80"/>
-              <w:left w:type="dxa" w:w="120"/>
-              <w:bottom w:type="dxa" w:w="80"/>
-              <w:right w:type="dxa" w:w="120"/>
-            </w:tcMar>
-          </w:tcPr>
-          <w:p>
-            <w:pPr>
-              <w:spacing w:after="80"/>
-            </w:pPr>
-            <w:r>
-              <w:t xml:space="preserve">Comment sais-tu qu'une dispute est vraiment terminée, que c'est pardonné ?</w:t>
-            </w:r>
-          </w:p>
-        </w:tc>
-        <w:tc>
-          <w:tcPr>
-            <w:tcW w:type="dxa" w:w="4559"/>
-            <w:tcBorders>
-              <w:top w:val="single" w:color="D9D2CA" w:sz="4"/>
-              <w:left w:val="single" w:color="D9D2CA" w:sz="4"/>
-              <w:bottom w:val="single" w:color="D9D2CA" w:sz="4"/>
-              <w:right w:val="single" w:color="D9D2CA" w:sz="4"/>
-            </w:tcBorders>
-            <w:shd w:fill="FBF8F3" w:color="auto" w:val="clear"/>
-            <w:tcMar>
-              <w:top w:type="dxa" w:w="80"/>
-              <w:left w:type="dxa" w:w="120"/>
-              <w:bottom w:type="dxa" w:w="80"/>
-              <w:right w:type="dxa" w:w="120"/>
-            </w:tcMar>
-          </w:tcPr>
-          <w:p>
-            <w:pPr>
-              <w:spacing w:after="80"/>
-            </w:pPr>
-            <w:r>
-              <w:t xml:space="preserve">How do you know an argument is really over, that it's forgiven?</w:t>
+              <w:t>10</w:t>
+            </w:r>
+          </w:p>
+        </w:tc>
+        <w:tc>
+          <w:tcPr>
+            <w:tcW w:type="dxa" w:w="4559"/>
+            <w:tcBorders>
+              <w:top w:val="single" w:color="D9D2CA" w:sz="4"/>
+              <w:left w:val="single" w:color="D9D2CA" w:sz="4"/>
+              <w:bottom w:val="single" w:color="D9D2CA" w:sz="4"/>
+              <w:right w:val="single" w:color="D9D2CA" w:sz="4"/>
+            </w:tcBorders>
+            <w:shd w:fill="FBF8F3" w:color="auto" w:val="clear"/>
+            <w:tcMar>
+              <w:top w:type="dxa" w:w="80"/>
+              <w:left w:type="dxa" w:w="120"/>
+              <w:bottom w:type="dxa" w:w="80"/>
+              <w:right w:type="dxa" w:w="120"/>
+            </w:tcMar>
+          </w:tcPr>
+          <w:p>
+            <w:pPr>
+              <w:spacing w:after="80"/>
+            </w:pPr>
+            <w:r>
+              <w:t>Comment sais-tu qu'une dispute est vraiment terminée, que c'est pardonné ?</w:t>
+            </w:r>
+          </w:p>
+        </w:tc>
+        <w:tc>
+          <w:tcPr>
+            <w:tcW w:type="dxa" w:w="4559"/>
+            <w:tcBorders>
+              <w:top w:val="single" w:color="D9D2CA" w:sz="4"/>
+              <w:left w:val="single" w:color="D9D2CA" w:sz="4"/>
+              <w:bottom w:val="single" w:color="D9D2CA" w:sz="4"/>
+              <w:right w:val="single" w:color="D9D2CA" w:sz="4"/>
+            </w:tcBorders>
+            <w:shd w:fill="FBF8F3" w:color="auto" w:val="clear"/>
+            <w:tcMar>
+              <w:top w:type="dxa" w:w="80"/>
+              <w:left w:type="dxa" w:w="120"/>
+              <w:bottom w:type="dxa" w:w="80"/>
+              <w:right w:type="dxa" w:w="120"/>
+            </w:tcMar>
+          </w:tcPr>
+          <w:p>
+            <w:pPr>
+              <w:spacing w:after="80"/>
+            </w:pPr>
+            <w:r>
+              <w:t>How do you know an argument is really over, that it's forgiven?</w:t>
             </w:r>
           </w:p>
         </w:tc>
@@ -11499,57 +11499,57 @@
               <w:spacing w:after="80"/>
             </w:pPr>
             <w:r>
-              <w:t xml:space="preserve">11</w:t>
-            </w:r>
-          </w:p>
-        </w:tc>
-        <w:tc>
-          <w:tcPr>
-            <w:tcW w:type="dxa" w:w="4559"/>
-            <w:tcBorders>
-              <w:top w:val="single" w:color="D9D2CA" w:sz="4"/>
-              <w:left w:val="single" w:color="D9D2CA" w:sz="4"/>
-              <w:bottom w:val="single" w:color="D9D2CA" w:sz="4"/>
-              <w:right w:val="single" w:color="D9D2CA" w:sz="4"/>
-            </w:tcBorders>
-            <w:tcMar>
-              <w:top w:type="dxa" w:w="80"/>
-              <w:left w:type="dxa" w:w="120"/>
-              <w:bottom w:type="dxa" w:w="80"/>
-              <w:right w:type="dxa" w:w="120"/>
-            </w:tcMar>
-          </w:tcPr>
-          <w:p>
-            <w:pPr>
-              <w:spacing w:after="80"/>
-            </w:pPr>
-            <w:r>
-              <w:t xml:space="preserve">Raconte une dispute qui vous a fait avancer, qui a débouché sur un vrai changement.</w:t>
-            </w:r>
-          </w:p>
-        </w:tc>
-        <w:tc>
-          <w:tcPr>
-            <w:tcW w:type="dxa" w:w="4559"/>
-            <w:tcBorders>
-              <w:top w:val="single" w:color="D9D2CA" w:sz="4"/>
-              <w:left w:val="single" w:color="D9D2CA" w:sz="4"/>
-              <w:bottom w:val="single" w:color="D9D2CA" w:sz="4"/>
-              <w:right w:val="single" w:color="D9D2CA" w:sz="4"/>
-            </w:tcBorders>
-            <w:tcMar>
-              <w:top w:type="dxa" w:w="80"/>
-              <w:left w:type="dxa" w:w="120"/>
-              <w:bottom w:type="dxa" w:w="80"/>
-              <w:right w:type="dxa" w:w="120"/>
-            </w:tcMar>
-          </w:tcPr>
-          <w:p>
-            <w:pPr>
-              <w:spacing w:after="80"/>
-            </w:pPr>
-            <w:r>
-              <w:t xml:space="preserve">Tell us about an argument that helped you move forward, that led to a real change.</w:t>
+              <w:t>11</w:t>
+            </w:r>
+          </w:p>
+        </w:tc>
+        <w:tc>
+          <w:tcPr>
+            <w:tcW w:type="dxa" w:w="4559"/>
+            <w:tcBorders>
+              <w:top w:val="single" w:color="D9D2CA" w:sz="4"/>
+              <w:left w:val="single" w:color="D9D2CA" w:sz="4"/>
+              <w:bottom w:val="single" w:color="D9D2CA" w:sz="4"/>
+              <w:right w:val="single" w:color="D9D2CA" w:sz="4"/>
+            </w:tcBorders>
+            <w:tcMar>
+              <w:top w:type="dxa" w:w="80"/>
+              <w:left w:type="dxa" w:w="120"/>
+              <w:bottom w:type="dxa" w:w="80"/>
+              <w:right w:type="dxa" w:w="120"/>
+            </w:tcMar>
+          </w:tcPr>
+          <w:p>
+            <w:pPr>
+              <w:spacing w:after="80"/>
+            </w:pPr>
+            <w:r>
+              <w:t>Raconte une dispute qui vous a fait avancer, qui a débouché sur un vrai changement.</w:t>
+            </w:r>
+          </w:p>
+        </w:tc>
+        <w:tc>
+          <w:tcPr>
+            <w:tcW w:type="dxa" w:w="4559"/>
+            <w:tcBorders>
+              <w:top w:val="single" w:color="D9D2CA" w:sz="4"/>
+              <w:left w:val="single" w:color="D9D2CA" w:sz="4"/>
+              <w:bottom w:val="single" w:color="D9D2CA" w:sz="4"/>
+              <w:right w:val="single" w:color="D9D2CA" w:sz="4"/>
+            </w:tcBorders>
+            <w:tcMar>
+              <w:top w:type="dxa" w:w="80"/>
+              <w:left w:type="dxa" w:w="120"/>
+              <w:bottom w:type="dxa" w:w="80"/>
+              <w:right w:type="dxa" w:w="120"/>
+            </w:tcMar>
+          </w:tcPr>
+          <w:p>
+            <w:pPr>
+              <w:spacing w:after="80"/>
+            </w:pPr>
+            <w:r>
+              <w:t>Tell us about an argument that helped you move forward, that led to a real change.</w:t>
             </w:r>
           </w:p>
         </w:tc>
@@ -11580,59 +11580,67 @@
               <w:spacing w:after="80"/>
             </w:pPr>
             <w:r>
-              <w:t xml:space="preserve">12</w:t>
-            </w:r>
-          </w:p>
-        </w:tc>
-        <w:tc>
-          <w:tcPr>
-            <w:tcW w:type="dxa" w:w="4559"/>
-            <w:tcBorders>
-              <w:top w:val="single" w:color="D9D2CA" w:sz="4"/>
-              <w:left w:val="single" w:color="D9D2CA" w:sz="4"/>
-              <w:bottom w:val="single" w:color="D9D2CA" w:sz="4"/>
-              <w:right w:val="single" w:color="D9D2CA" w:sz="4"/>
-            </w:tcBorders>
-            <w:shd w:fill="FBF8F3" w:color="auto" w:val="clear"/>
-            <w:tcMar>
-              <w:top w:type="dxa" w:w="80"/>
-              <w:left w:type="dxa" w:w="120"/>
-              <w:bottom w:type="dxa" w:w="80"/>
-              <w:right w:type="dxa" w:w="120"/>
-            </w:tcMar>
-          </w:tcPr>
-          <w:p>
-            <w:pPr>
-              <w:spacing w:after="80"/>
-            </w:pPr>
-            <w:r>
-              <w:t xml:space="preserve">Exercice : choisis un reproche récurrent et reformule-le en partant de « je » : ce que tu ressens, ce dont tu as besoin, une proposition. Exemple : « Tu ne fais jamais les repas » devient « La charge des repas me pèse. J'aurais besoin qu'on la partage autrement. On cherche une solution qui nous convienne à deux ? »</w:t>
-            </w:r>
-          </w:p>
-        </w:tc>
-        <w:tc>
-          <w:tcPr>
-            <w:tcW w:type="dxa" w:w="4559"/>
-            <w:tcBorders>
-              <w:top w:val="single" w:color="D9D2CA" w:sz="4"/>
-              <w:left w:val="single" w:color="D9D2CA" w:sz="4"/>
-              <w:bottom w:val="single" w:color="D9D2CA" w:sz="4"/>
-              <w:right w:val="single" w:color="D9D2CA" w:sz="4"/>
-            </w:tcBorders>
-            <w:shd w:fill="FBF8F3" w:color="auto" w:val="clear"/>
-            <w:tcMar>
-              <w:top w:type="dxa" w:w="80"/>
-              <w:left w:type="dxa" w:w="120"/>
-              <w:bottom w:type="dxa" w:w="80"/>
-              <w:right w:type="dxa" w:w="120"/>
-            </w:tcMar>
-          </w:tcPr>
-          <w:p>
-            <w:pPr>
-              <w:spacing w:after="80"/>
-            </w:pPr>
-            <w:r>
-              <w:t xml:space="preserve">Exercise: pick a recurring complaint and rephrase it starting with "I": what you feel, what you need, a suggestion. Example: "You never cook" becomes "The burden of cooking weighs on me. I would need us to share it differently. Shall we look for a solution that works for both of us?"</w:t>
+              <w:t>12</w:t>
+            </w:r>
+          </w:p>
+        </w:tc>
+        <w:tc>
+          <w:tcPr>
+            <w:tcW w:type="dxa" w:w="4559"/>
+            <w:tcBorders>
+              <w:top w:val="single" w:color="D9D2CA" w:sz="4"/>
+              <w:left w:val="single" w:color="D9D2CA" w:sz="4"/>
+              <w:bottom w:val="single" w:color="D9D2CA" w:sz="4"/>
+              <w:right w:val="single" w:color="D9D2CA" w:sz="4"/>
+            </w:tcBorders>
+            <w:shd w:fill="FBF8F3" w:color="auto" w:val="clear"/>
+            <w:tcMar>
+              <w:top w:type="dxa" w:w="80"/>
+              <w:left w:type="dxa" w:w="120"/>
+              <w:bottom w:type="dxa" w:w="80"/>
+              <w:right w:type="dxa" w:w="120"/>
+            </w:tcMar>
+          </w:tcPr>
+          <w:p>
+            <w:pPr>
+              <w:spacing w:after="80"/>
+            </w:pPr>
+            <w:r>
+              <w:t>Exercice : choisis un reproche récurrent que tu adresses à l'autre.</w:t>
+              <w:br/>
+              <w:t>Maintenant, essaye de le reformuler de manière « non violente », c'est-à-dire en utilisant « je » à la place de « tu ». Commence par dire ce que tu ressens, puis ce dont tu as besoin, et enfin, formule une proposition.</w:t>
+              <w:br/>
+              <w:t>Par exemple, « Tu ne fais jamais les repas » devient « La charge des repas me pèse. J'aurais besoin qu'on la partage autrement. On cherche une solution qui nous convienne à deux ? ». À toi maintenant.</w:t>
+            </w:r>
+          </w:p>
+        </w:tc>
+        <w:tc>
+          <w:tcPr>
+            <w:tcW w:type="dxa" w:w="4559"/>
+            <w:tcBorders>
+              <w:top w:val="single" w:color="D9D2CA" w:sz="4"/>
+              <w:left w:val="single" w:color="D9D2CA" w:sz="4"/>
+              <w:bottom w:val="single" w:color="D9D2CA" w:sz="4"/>
+              <w:right w:val="single" w:color="D9D2CA" w:sz="4"/>
+            </w:tcBorders>
+            <w:shd w:fill="FBF8F3" w:color="auto" w:val="clear"/>
+            <w:tcMar>
+              <w:top w:type="dxa" w:w="80"/>
+              <w:left w:type="dxa" w:w="120"/>
+              <w:bottom w:type="dxa" w:w="80"/>
+              <w:right w:type="dxa" w:w="120"/>
+            </w:tcMar>
+          </w:tcPr>
+          <w:p>
+            <w:pPr>
+              <w:spacing w:after="80"/>
+            </w:pPr>
+            <w:r>
+              <w:t>Exercise: pick a recurring complaint you make to your partner.</w:t>
+              <w:br/>
+              <w:t>Now try to rephrase it in a "non-violent" way, that is, using "I" instead of "you". Start by saying what you feel, then what you need, and finally, make a suggestion.</w:t>
+              <w:br/>
+              <w:t>For example, "You never cook" becomes "The burden of cooking weighs on me. I would need us to share it differently. Shall we look for a solution that works for both of us?". Your turn now.</w:t>
             </w:r>
           </w:p>
         </w:tc>
@@ -11650,152 +11658,100 @@
               <w:bottom w:val="single" w:color="D9D2CA" w:sz="4"/>
               <w:right w:val="single" w:color="D9D2CA" w:sz="4"/>
             </w:tcBorders>
-            <w:tcMar>
-              <w:top w:type="dxa" w:w="80"/>
-              <w:left w:type="dxa" w:w="120"/>
-              <w:bottom w:type="dxa" w:w="80"/>
-              <w:right w:type="dxa" w:w="120"/>
-            </w:tcMar>
-          </w:tcPr>
-          <w:p>
-            <w:pPr>
-              <w:spacing w:after="80"/>
-            </w:pPr>
-            <w:r>
-              <w:t xml:space="preserve">13</w:t>
-            </w:r>
-          </w:p>
-        </w:tc>
-        <w:tc>
-          <w:tcPr>
-            <w:tcW w:type="dxa" w:w="4559"/>
-            <w:tcBorders>
-              <w:top w:val="single" w:color="D9D2CA" w:sz="4"/>
-              <w:left w:val="single" w:color="D9D2CA" w:sz="4"/>
-              <w:bottom w:val="single" w:color="D9D2CA" w:sz="4"/>
-              <w:right w:val="single" w:color="D9D2CA" w:sz="4"/>
-            </w:tcBorders>
-            <w:tcMar>
-              <w:top w:type="dxa" w:w="80"/>
-              <w:left w:type="dxa" w:w="120"/>
-              <w:bottom w:type="dxa" w:w="80"/>
-              <w:right w:type="dxa" w:w="120"/>
-            </w:tcMar>
-          </w:tcPr>
-          <w:p>
-            <w:pPr>
-              <w:spacing w:after="80"/>
-            </w:pPr>
-            <w:r>
-              <w:t xml:space="preserve">Comment as-tu reçu la reformulation de l'autre ? Qu'est-ce que ça change par rapport à d'habitude ?</w:t>
-            </w:r>
-          </w:p>
-        </w:tc>
-        <w:tc>
-          <w:tcPr>
-            <w:tcW w:type="dxa" w:w="4559"/>
-            <w:tcBorders>
-              <w:top w:val="single" w:color="D9D2CA" w:sz="4"/>
-              <w:left w:val="single" w:color="D9D2CA" w:sz="4"/>
-              <w:bottom w:val="single" w:color="D9D2CA" w:sz="4"/>
-              <w:right w:val="single" w:color="D9D2CA" w:sz="4"/>
-            </w:tcBorders>
-            <w:tcMar>
-              <w:top w:type="dxa" w:w="80"/>
-              <w:left w:type="dxa" w:w="120"/>
-              <w:bottom w:type="dxa" w:w="80"/>
-              <w:right w:type="dxa" w:w="120"/>
-            </w:tcMar>
-          </w:tcPr>
-          <w:p>
-            <w:pPr>
-              <w:spacing w:after="80"/>
-            </w:pPr>
-            <w:r>
-              <w:t xml:space="preserve">How did you receive your partner's rephrasing? What does it change compared to usual?</w:t>
-            </w:r>
-          </w:p>
-        </w:tc>
-      </w:tr>
-      <w:tr>
-        <w:trPr>
-          <w:cantSplit w:val="false"/>
-        </w:trPr>
-        <w:tc>
-          <w:tcPr>
-            <w:tcW w:type="dxa" w:w="520"/>
-            <w:tcBorders>
-              <w:top w:val="single" w:color="D9D2CA" w:sz="4"/>
-              <w:left w:val="single" w:color="D9D2CA" w:sz="4"/>
-              <w:bottom w:val="single" w:color="D9D2CA" w:sz="4"/>
-              <w:right w:val="single" w:color="D9D2CA" w:sz="4"/>
-            </w:tcBorders>
-            <w:shd w:fill="FBF8F3" w:color="auto" w:val="clear"/>
-            <w:tcMar>
-              <w:top w:type="dxa" w:w="80"/>
-              <w:left w:type="dxa" w:w="120"/>
-              <w:bottom w:type="dxa" w:w="80"/>
-              <w:right w:type="dxa" w:w="120"/>
-            </w:tcMar>
-          </w:tcPr>
-          <w:p>
-            <w:pPr>
-              <w:spacing w:after="80"/>
-            </w:pPr>
-            <w:r>
-              <w:t xml:space="preserve">14</w:t>
-            </w:r>
-          </w:p>
-        </w:tc>
-        <w:tc>
-          <w:tcPr>
-            <w:tcW w:type="dxa" w:w="4559"/>
-            <w:tcBorders>
-              <w:top w:val="single" w:color="D9D2CA" w:sz="4"/>
-              <w:left w:val="single" w:color="D9D2CA" w:sz="4"/>
-              <w:bottom w:val="single" w:color="D9D2CA" w:sz="4"/>
-              <w:right w:val="single" w:color="D9D2CA" w:sz="4"/>
-            </w:tcBorders>
-            <w:shd w:fill="FBF8F3" w:color="auto" w:val="clear"/>
-            <w:tcMar>
-              <w:top w:type="dxa" w:w="80"/>
-              <w:left w:type="dxa" w:w="120"/>
-              <w:bottom w:type="dxa" w:w="80"/>
-              <w:right w:type="dxa" w:w="120"/>
-            </w:tcMar>
-          </w:tcPr>
-          <w:p>
-            <w:pPr>
-              <w:spacing w:after="80"/>
-            </w:pPr>
-            <w:r>
-              <w:t xml:space="preserve">Quelles règles du jeu aimerais-tu adopter pour vos prochaines disputes : pas après 23 h, pas devant les enfants, pause de 20 minutes, ni « toujours » ni « jamais »… ?</w:t>
-            </w:r>
-          </w:p>
-        </w:tc>
-        <w:tc>
-          <w:tcPr>
-            <w:tcW w:type="dxa" w:w="4559"/>
-            <w:tcBorders>
-              <w:top w:val="single" w:color="D9D2CA" w:sz="4"/>
-              <w:left w:val="single" w:color="D9D2CA" w:sz="4"/>
-              <w:bottom w:val="single" w:color="D9D2CA" w:sz="4"/>
-              <w:right w:val="single" w:color="D9D2CA" w:sz="4"/>
-            </w:tcBorders>
-            <w:shd w:fill="FBF8F3" w:color="auto" w:val="clear"/>
-            <w:tcMar>
-              <w:top w:type="dxa" w:w="80"/>
-              <w:left w:type="dxa" w:w="120"/>
-              <w:bottom w:type="dxa" w:w="80"/>
-              <w:right w:type="dxa" w:w="120"/>
-            </w:tcMar>
-          </w:tcPr>
-          <w:p>
-            <w:pPr>
-              <w:spacing w:after="80"/>
-            </w:pPr>
-            <w:r>
-              <w:t xml:space="preserve">What ground rules would you like to adopt for your next arguments: not after 11 p.m., not in front of the children, a 20-minute break, no "always" or "never"… ?</w:t>
+            <w:shd w:fill="FBF8F3" w:color="auto" w:val="clear"/>
+            <w:tcMar>
+              <w:top w:type="dxa" w:w="80"/>
+              <w:left w:type="dxa" w:w="120"/>
+              <w:bottom w:type="dxa" w:w="80"/>
+              <w:right w:type="dxa" w:w="120"/>
+            </w:tcMar>
+          </w:tcPr>
+          <w:p>
+            <w:pPr>
+              <w:spacing w:after="80"/>
+            </w:pPr>
+            <w:r>
+              <w:t>13</w:t>
+            </w:r>
+          </w:p>
+        </w:tc>
+        <w:tc>
+          <w:tcPr>
+            <w:tcW w:type="dxa" w:w="4559"/>
+            <w:tcBorders>
+              <w:top w:val="single" w:color="D9D2CA" w:sz="4"/>
+              <w:left w:val="single" w:color="D9D2CA" w:sz="4"/>
+              <w:bottom w:val="single" w:color="D9D2CA" w:sz="4"/>
+              <w:right w:val="single" w:color="D9D2CA" w:sz="4"/>
+            </w:tcBorders>
+            <w:shd w:fill="FBF8F3" w:color="auto" w:val="clear"/>
+            <w:tcMar>
+              <w:top w:type="dxa" w:w="80"/>
+              <w:left w:type="dxa" w:w="120"/>
+              <w:bottom w:type="dxa" w:w="80"/>
+              <w:right w:type="dxa" w:w="120"/>
+            </w:tcMar>
+          </w:tcPr>
+          <w:p>
+            <w:pPr>
+              <w:spacing w:after="80"/>
+            </w:pPr>
+            <w:r>
+              <w:t>Quelles règles du jeu aimerais-tu adopter pour vos prochaines disputes ?</w:t>
+              <w:br/>
+              <w:t>(coche ce que tu voudrais essayer)</w:t>
+              <w:br/>
+              <w:t>☐ Pas après 21 h</w:t>
+              <w:br/>
+              <w:t>☐ Pas devant les enfants</w:t>
+              <w:br/>
+              <w:t>☐ Pas de cris</w:t>
+              <w:br/>
+              <w:t>☐ Pas d'emploi de mots comme « toujours » ou « jamais »</w:t>
+              <w:br/>
+              <w:t>☐ Seulement après avoir pris 5 minutes pour respirer dehors</w:t>
+              <w:br/>
+              <w:t>☐ Autre : écris ici tes idées pour favoriser l'apaisement</w:t>
+            </w:r>
+          </w:p>
+        </w:tc>
+        <w:tc>
+          <w:tcPr>
+            <w:tcW w:type="dxa" w:w="4559"/>
+            <w:tcBorders>
+              <w:top w:val="single" w:color="D9D2CA" w:sz="4"/>
+              <w:left w:val="single" w:color="D9D2CA" w:sz="4"/>
+              <w:bottom w:val="single" w:color="D9D2CA" w:sz="4"/>
+              <w:right w:val="single" w:color="D9D2CA" w:sz="4"/>
+            </w:tcBorders>
+            <w:shd w:fill="FBF8F3" w:color="auto" w:val="clear"/>
+            <w:tcMar>
+              <w:top w:type="dxa" w:w="80"/>
+              <w:left w:type="dxa" w:w="120"/>
+              <w:bottom w:type="dxa" w:w="80"/>
+              <w:right w:type="dxa" w:w="120"/>
+            </w:tcMar>
+          </w:tcPr>
+          <w:p>
+            <w:pPr>
+              <w:spacing w:after="80"/>
+            </w:pPr>
+            <w:r>
+              <w:t>What ground rules would you like to adopt for your next arguments?</w:t>
+              <w:br/>
+              <w:t>(check the ones you'd like to try)</w:t>
+              <w:br/>
+              <w:t>☐ Not after 9 p.m.</w:t>
+              <w:br/>
+              <w:t>☐ Not in front of the children</w:t>
+              <w:br/>
+              <w:t>☐ No shouting</w:t>
+              <w:br/>
+              <w:t>☐ No words like "always" or "never"</w:t>
+              <w:br/>
+              <w:t>☐ Only after taking 5 minutes to breathe outside</w:t>
+              <w:br/>
+              <w:t>☐ Other: write your ideas for calming things down here</w:t>
             </w:r>
           </w:p>
         </w:tc>
@@ -11974,32 +11930,32 @@
               <w:spacing w:after="80"/>
             </w:pPr>
             <w:r>
-              <w:t xml:space="preserve">Qu'est-ce que cet échange t'a fait comprendre sur vos disputes, que tu ne voyais pas avant ?</w:t>
-            </w:r>
-          </w:p>
-        </w:tc>
-        <w:tc>
-          <w:tcPr>
-            <w:tcW w:type="dxa" w:w="4559"/>
-            <w:tcBorders>
-              <w:top w:val="single" w:color="D9D2CA" w:sz="4"/>
-              <w:left w:val="single" w:color="D9D2CA" w:sz="4"/>
-              <w:bottom w:val="single" w:color="D9D2CA" w:sz="4"/>
-              <w:right w:val="single" w:color="D9D2CA" w:sz="4"/>
-            </w:tcBorders>
-            <w:tcMar>
-              <w:top w:type="dxa" w:w="80"/>
-              <w:left w:type="dxa" w:w="120"/>
-              <w:bottom w:type="dxa" w:w="80"/>
-              <w:right w:type="dxa" w:w="120"/>
-            </w:tcMar>
-          </w:tcPr>
-          <w:p>
-            <w:pPr>
-              <w:spacing w:after="80"/>
-            </w:pPr>
-            <w:r>
-              <w:t xml:space="preserve">What did this conversation help you understand about your arguments that you didn't see before?</w:t>
+              <w:t>Quels sont les déclencheurs sur lesquels tu vas pouvoir essayer d'avoir une attention particulière pour ne pas les laisser détériorer ton harmonie de couple ?</w:t>
+            </w:r>
+          </w:p>
+        </w:tc>
+        <w:tc>
+          <w:tcPr>
+            <w:tcW w:type="dxa" w:w="4559"/>
+            <w:tcBorders>
+              <w:top w:val="single" w:color="D9D2CA" w:sz="4"/>
+              <w:left w:val="single" w:color="D9D2CA" w:sz="4"/>
+              <w:bottom w:val="single" w:color="D9D2CA" w:sz="4"/>
+              <w:right w:val="single" w:color="D9D2CA" w:sz="4"/>
+            </w:tcBorders>
+            <w:tcMar>
+              <w:top w:type="dxa" w:w="80"/>
+              <w:left w:type="dxa" w:w="120"/>
+              <w:bottom w:type="dxa" w:w="80"/>
+              <w:right w:type="dxa" w:w="120"/>
+            </w:tcMar>
+          </w:tcPr>
+          <w:p>
+            <w:pPr>
+              <w:spacing w:after="80"/>
+            </w:pPr>
+            <w:r>
+              <w:t>Which triggers will you try to pay particular attention to, so they don't damage the harmony in your relationship?</w:t>
             </w:r>
           </w:p>
         </w:tc>
@@ -12054,32 +12010,36 @@
               <w:spacing w:after="80"/>
             </w:pPr>
             <w:r>
-              <w:t xml:space="preserve">Parmi les règles du jeu évoquées, laquelle te semble indispensable ?</w:t>
-            </w:r>
-          </w:p>
-        </w:tc>
-        <w:tc>
-          <w:tcPr>
-            <w:tcW w:type="dxa" w:w="4559"/>
-            <w:tcBorders>
-              <w:top w:val="single" w:color="D9D2CA" w:sz="4"/>
-              <w:left w:val="single" w:color="D9D2CA" w:sz="4"/>
-              <w:bottom w:val="single" w:color="D9D2CA" w:sz="4"/>
-              <w:right w:val="single" w:color="D9D2CA" w:sz="4"/>
-            </w:tcBorders>
-            <w:tcMar>
-              <w:top w:type="dxa" w:w="80"/>
-              <w:left w:type="dxa" w:w="120"/>
-              <w:bottom w:type="dxa" w:w="80"/>
-              <w:right w:type="dxa" w:w="120"/>
-            </w:tcMar>
-          </w:tcPr>
-          <w:p>
-            <w:pPr>
-              <w:spacing w:after="80"/>
-            </w:pPr>
-            <w:r>
-              <w:t xml:space="preserve">Among the ground rules you discussed, which one seems essential to you?</w:t>
+              <w:t>Quelles techniques allez-vous essayer pour les prochaines disputes ?</w:t>
+              <w:br/>
+              <w:t>Il faut que cela vous permette d'identifier le vrai besoin qui se cache derrière, laisser sortir l'émotion, reformuler de manière apaisée pour trouver une solution rationnelle, clore en se redisant qu'on s'aime.</w:t>
+            </w:r>
+          </w:p>
+        </w:tc>
+        <w:tc>
+          <w:tcPr>
+            <w:tcW w:type="dxa" w:w="4559"/>
+            <w:tcBorders>
+              <w:top w:val="single" w:color="D9D2CA" w:sz="4"/>
+              <w:left w:val="single" w:color="D9D2CA" w:sz="4"/>
+              <w:bottom w:val="single" w:color="D9D2CA" w:sz="4"/>
+              <w:right w:val="single" w:color="D9D2CA" w:sz="4"/>
+            </w:tcBorders>
+            <w:tcMar>
+              <w:top w:type="dxa" w:w="80"/>
+              <w:left w:type="dxa" w:w="120"/>
+              <w:bottom w:type="dxa" w:w="80"/>
+              <w:right w:type="dxa" w:w="120"/>
+            </w:tcMar>
+          </w:tcPr>
+          <w:p>
+            <w:pPr>
+              <w:spacing w:after="80"/>
+            </w:pPr>
+            <w:r>
+              <w:t>Which techniques will you try during your next arguments?</w:t>
+              <w:br/>
+              <w:t>They should help you identify the real need hiding underneath, let the emotion out, rephrase things calmly to find a rational solution, and close by telling each other again that you love each other.</w:t>
             </w:r>
           </w:p>
         </w:tc>

</xml_diff>

<commit_message>
Module 8 : nouvelles questions de fin de module, techniques à cocher
- Conclusion 1 : « Quels sont les déclencheurs habituels chez toi ? Et chez l'autre ? »
- Conclusion 2 : techniques à cocher pour les prochaines disputes, avec un
  champ libre « Autre » (reprend et complète les règles du jeu)
- Question « règles du jeu » retirée des questions du module, désormais
  dans la conclusion
- Les questions de fin de module acceptent des cases à cocher (révélation,
  journal, export des données)
- Documents Word des questions mis à jour

Co-Authored-By: Claude Opus 5.5 <noreply@anthropic.com>
Claude-Session: https://claude.ai/code/session_012mXc7jW6jsaFWUdreJine4
</commit_message>
<xml_diff>
--- a/docs/YES-BOX-questions-FR-EN.docx
+++ b/docs/YES-BOX-questions-FR-EN.docx
@@ -11645,117 +11645,6 @@
           </w:p>
         </w:tc>
       </w:tr>
-      <w:tr>
-        <w:trPr>
-          <w:cantSplit w:val="false"/>
-        </w:trPr>
-        <w:tc>
-          <w:tcPr>
-            <w:tcW w:type="dxa" w:w="520"/>
-            <w:tcBorders>
-              <w:top w:val="single" w:color="D9D2CA" w:sz="4"/>
-              <w:left w:val="single" w:color="D9D2CA" w:sz="4"/>
-              <w:bottom w:val="single" w:color="D9D2CA" w:sz="4"/>
-              <w:right w:val="single" w:color="D9D2CA" w:sz="4"/>
-            </w:tcBorders>
-            <w:shd w:fill="FBF8F3" w:color="auto" w:val="clear"/>
-            <w:tcMar>
-              <w:top w:type="dxa" w:w="80"/>
-              <w:left w:type="dxa" w:w="120"/>
-              <w:bottom w:type="dxa" w:w="80"/>
-              <w:right w:type="dxa" w:w="120"/>
-            </w:tcMar>
-          </w:tcPr>
-          <w:p>
-            <w:pPr>
-              <w:spacing w:after="80"/>
-            </w:pPr>
-            <w:r>
-              <w:t>13</w:t>
-            </w:r>
-          </w:p>
-        </w:tc>
-        <w:tc>
-          <w:tcPr>
-            <w:tcW w:type="dxa" w:w="4559"/>
-            <w:tcBorders>
-              <w:top w:val="single" w:color="D9D2CA" w:sz="4"/>
-              <w:left w:val="single" w:color="D9D2CA" w:sz="4"/>
-              <w:bottom w:val="single" w:color="D9D2CA" w:sz="4"/>
-              <w:right w:val="single" w:color="D9D2CA" w:sz="4"/>
-            </w:tcBorders>
-            <w:shd w:fill="FBF8F3" w:color="auto" w:val="clear"/>
-            <w:tcMar>
-              <w:top w:type="dxa" w:w="80"/>
-              <w:left w:type="dxa" w:w="120"/>
-              <w:bottom w:type="dxa" w:w="80"/>
-              <w:right w:type="dxa" w:w="120"/>
-            </w:tcMar>
-          </w:tcPr>
-          <w:p>
-            <w:pPr>
-              <w:spacing w:after="80"/>
-            </w:pPr>
-            <w:r>
-              <w:t>Quelles règles du jeu aimerais-tu adopter pour vos prochaines disputes ?</w:t>
-              <w:br/>
-              <w:t>(coche ce que tu voudrais essayer)</w:t>
-              <w:br/>
-              <w:t>☐ Pas après 21 h</w:t>
-              <w:br/>
-              <w:t>☐ Pas devant les enfants</w:t>
-              <w:br/>
-              <w:t>☐ Pas de cris</w:t>
-              <w:br/>
-              <w:t>☐ Pas d'emploi de mots comme « toujours » ou « jamais »</w:t>
-              <w:br/>
-              <w:t>☐ Seulement après avoir pris 5 minutes pour respirer dehors</w:t>
-              <w:br/>
-              <w:t>☐ Autre : écris ici tes idées pour favoriser l'apaisement</w:t>
-            </w:r>
-          </w:p>
-        </w:tc>
-        <w:tc>
-          <w:tcPr>
-            <w:tcW w:type="dxa" w:w="4559"/>
-            <w:tcBorders>
-              <w:top w:val="single" w:color="D9D2CA" w:sz="4"/>
-              <w:left w:val="single" w:color="D9D2CA" w:sz="4"/>
-              <w:bottom w:val="single" w:color="D9D2CA" w:sz="4"/>
-              <w:right w:val="single" w:color="D9D2CA" w:sz="4"/>
-            </w:tcBorders>
-            <w:shd w:fill="FBF8F3" w:color="auto" w:val="clear"/>
-            <w:tcMar>
-              <w:top w:type="dxa" w:w="80"/>
-              <w:left w:type="dxa" w:w="120"/>
-              <w:bottom w:type="dxa" w:w="80"/>
-              <w:right w:type="dxa" w:w="120"/>
-            </w:tcMar>
-          </w:tcPr>
-          <w:p>
-            <w:pPr>
-              <w:spacing w:after="80"/>
-            </w:pPr>
-            <w:r>
-              <w:t>What ground rules would you like to adopt for your next arguments?</w:t>
-              <w:br/>
-              <w:t>(check the ones you'd like to try)</w:t>
-              <w:br/>
-              <w:t>☐ Not after 9 p.m.</w:t>
-              <w:br/>
-              <w:t>☐ Not in front of the children</w:t>
-              <w:br/>
-              <w:t>☐ No shouting</w:t>
-              <w:br/>
-              <w:t>☐ No words like "always" or "never"</w:t>
-              <w:br/>
-              <w:t>☐ Only after taking 5 minutes to breathe outside</w:t>
-              <w:br/>
-              <w:t>☐ Other: write your ideas for calming things down here</w:t>
-            </w:r>
-          </w:p>
-        </w:tc>
-      </w:tr>
     </w:tbl>
     <w:p>
       <w:pPr>
@@ -11930,32 +11819,32 @@
               <w:spacing w:after="80"/>
             </w:pPr>
             <w:r>
-              <w:t>Quels sont les déclencheurs sur lesquels tu vas pouvoir essayer d'avoir une attention particulière pour ne pas les laisser détériorer ton harmonie de couple ?</w:t>
-            </w:r>
-          </w:p>
-        </w:tc>
-        <w:tc>
-          <w:tcPr>
-            <w:tcW w:type="dxa" w:w="4559"/>
-            <w:tcBorders>
-              <w:top w:val="single" w:color="D9D2CA" w:sz="4"/>
-              <w:left w:val="single" w:color="D9D2CA" w:sz="4"/>
-              <w:bottom w:val="single" w:color="D9D2CA" w:sz="4"/>
-              <w:right w:val="single" w:color="D9D2CA" w:sz="4"/>
-            </w:tcBorders>
-            <w:tcMar>
-              <w:top w:type="dxa" w:w="80"/>
-              <w:left w:type="dxa" w:w="120"/>
-              <w:bottom w:type="dxa" w:w="80"/>
-              <w:right w:type="dxa" w:w="120"/>
-            </w:tcMar>
-          </w:tcPr>
-          <w:p>
-            <w:pPr>
-              <w:spacing w:after="80"/>
-            </w:pPr>
-            <w:r>
-              <w:t>Which triggers will you try to pay particular attention to, so they don't damage the harmony in your relationship?</w:t>
+              <w:t>Quels sont les déclencheurs habituels chez toi ? Et chez l'autre ?</w:t>
+            </w:r>
+          </w:p>
+        </w:tc>
+        <w:tc>
+          <w:tcPr>
+            <w:tcW w:type="dxa" w:w="4559"/>
+            <w:tcBorders>
+              <w:top w:val="single" w:color="D9D2CA" w:sz="4"/>
+              <w:left w:val="single" w:color="D9D2CA" w:sz="4"/>
+              <w:bottom w:val="single" w:color="D9D2CA" w:sz="4"/>
+              <w:right w:val="single" w:color="D9D2CA" w:sz="4"/>
+            </w:tcBorders>
+            <w:tcMar>
+              <w:top w:type="dxa" w:w="80"/>
+              <w:left w:type="dxa" w:w="120"/>
+              <w:bottom w:type="dxa" w:w="80"/>
+              <w:right w:type="dxa" w:w="120"/>
+            </w:tcMar>
+          </w:tcPr>
+          <w:p>
+            <w:pPr>
+              <w:spacing w:after="80"/>
+            </w:pPr>
+            <w:r>
+              <w:t>What usually triggers you? And your partner?</w:t>
             </w:r>
           </w:p>
         </w:tc>
@@ -12010,36 +11899,72 @@
               <w:spacing w:after="80"/>
             </w:pPr>
             <w:r>
-              <w:t>Quelles techniques allez-vous essayer pour les prochaines disputes ?</w:t>
+              <w:t>Quelles techniques aimerais-tu essayer pour vos prochaines disputes ?</w:t>
               <w:br/>
-              <w:t>Il faut que cela vous permette d'identifier le vrai besoin qui se cache derrière, laisser sortir l'émotion, reformuler de manière apaisée pour trouver une solution rationnelle, clore en se redisant qu'on s'aime.</w:t>
-            </w:r>
-          </w:p>
-        </w:tc>
-        <w:tc>
-          <w:tcPr>
-            <w:tcW w:type="dxa" w:w="4559"/>
-            <w:tcBorders>
-              <w:top w:val="single" w:color="D9D2CA" w:sz="4"/>
-              <w:left w:val="single" w:color="D9D2CA" w:sz="4"/>
-              <w:bottom w:val="single" w:color="D9D2CA" w:sz="4"/>
-              <w:right w:val="single" w:color="D9D2CA" w:sz="4"/>
-            </w:tcBorders>
-            <w:tcMar>
-              <w:top w:type="dxa" w:w="80"/>
-              <w:left w:type="dxa" w:w="120"/>
-              <w:bottom w:type="dxa" w:w="80"/>
-              <w:right w:type="dxa" w:w="120"/>
-            </w:tcMar>
-          </w:tcPr>
-          <w:p>
-            <w:pPr>
-              <w:spacing w:after="80"/>
-            </w:pPr>
-            <w:r>
-              <w:t>Which techniques will you try during your next arguments?</w:t>
+              <w:t>(coche ce que tu voudrais essayer)</w:t>
               <w:br/>
-              <w:t>They should help you identify the real need hiding underneath, let the emotion out, rephrase things calmly to find a rational solution, and close by telling each other again that you love each other.</w:t>
+              <w:t>☐ Pas de dispute après 21 h</w:t>
+              <w:br/>
+              <w:t>☐ Pas devant les enfants</w:t>
+              <w:br/>
+              <w:t>☐ Pas de cris</w:t>
+              <w:br/>
+              <w:t>☐ Pas d'emploi de mots comme « toujours » ou « jamais »</w:t>
+              <w:br/>
+              <w:t>☐ Seulement après être allé·e respirer dehors 5 minutes</w:t>
+              <w:br/>
+              <w:t>☐ Aller se défouler avant d'aborder une discussion sensible</w:t>
+              <w:br/>
+              <w:t>☐ Identifier son VRAI besoin et l'émotion que cela déclenche pour ne pas tout mélanger</w:t>
+              <w:br/>
+              <w:t>☐ Reformuler avec la communication non-violente (qu'on a vue dans la question d'avant)</w:t>
+              <w:br/>
+              <w:t>☐ Autre : écris ici tes idées pour favoriser l'apaisement</w:t>
+            </w:r>
+          </w:p>
+        </w:tc>
+        <w:tc>
+          <w:tcPr>
+            <w:tcW w:type="dxa" w:w="4559"/>
+            <w:tcBorders>
+              <w:top w:val="single" w:color="D9D2CA" w:sz="4"/>
+              <w:left w:val="single" w:color="D9D2CA" w:sz="4"/>
+              <w:bottom w:val="single" w:color="D9D2CA" w:sz="4"/>
+              <w:right w:val="single" w:color="D9D2CA" w:sz="4"/>
+            </w:tcBorders>
+            <w:tcMar>
+              <w:top w:type="dxa" w:w="80"/>
+              <w:left w:type="dxa" w:w="120"/>
+              <w:bottom w:type="dxa" w:w="80"/>
+              <w:right w:type="dxa" w:w="120"/>
+            </w:tcMar>
+          </w:tcPr>
+          <w:p>
+            <w:pPr>
+              <w:spacing w:after="80"/>
+            </w:pPr>
+            <w:r>
+              <w:t>Which techniques would you like to try for your next arguments?</w:t>
+              <w:br/>
+              <w:t>(check the ones you'd like to try)</w:t>
+              <w:br/>
+              <w:t>☐ No arguing after 9 p.m.</w:t>
+              <w:br/>
+              <w:t>☐ Not in front of the children</w:t>
+              <w:br/>
+              <w:t>☐ No shouting</w:t>
+              <w:br/>
+              <w:t>☐ No words like "always" or "never"</w:t>
+              <w:br/>
+              <w:t>☐ Only after stepping outside to breathe for 5 minutes</w:t>
+              <w:br/>
+              <w:t>☐ Letting off steam before bringing up a sensitive topic</w:t>
+              <w:br/>
+              <w:t>☐ Identifying your REAL need and the emotion it triggers, so you don't mix everything up</w:t>
+              <w:br/>
+              <w:t>☐ Rephrasing with nonviolent communication (as in the previous question)</w:t>
+              <w:br/>
+              <w:t>☐ Other: write your ideas for calming things down here</w:t>
             </w:r>
           </w:p>
         </w:tc>

</xml_diff>

<commit_message>
Module 8 : renvoi à l'exercice de reformulation dans les techniques à cocher
Co-Authored-By: Claude Opus 5.5 <noreply@anthropic.com>
Claude-Session: https://claude.ai/code/session_012mXc7jW6jsaFWUdreJine4
</commit_message>
<xml_diff>
--- a/docs/YES-BOX-questions-FR-EN.docx
+++ b/docs/YES-BOX-questions-FR-EN.docx
@@ -11917,7 +11917,7 @@
               <w:br/>
               <w:t>☐ Identifier son VRAI besoin et l'émotion que cela déclenche pour ne pas tout mélanger</w:t>
               <w:br/>
-              <w:t>☐ Reformuler avec la communication non-violente (qu'on a vue dans la question d'avant)</w:t>
+              <w:t>☐ Reformuler avec la communication non-violente (vue dans l'exercice de reformulation)</w:t>
               <w:br/>
               <w:t>☐ Autre : écris ici tes idées pour favoriser l'apaisement</w:t>
             </w:r>
@@ -11962,7 +11962,7 @@
               <w:br/>
               <w:t>☐ Identifying your REAL need and the emotion it triggers, so you don't mix everything up</w:t>
               <w:br/>
-              <w:t>☐ Rephrasing with nonviolent communication (as in the previous question)</w:t>
+              <w:t>☐ Rephrasing with nonviolent communication (as in the rephrasing exercise)</w:t>
               <w:br/>
               <w:t>☐ Other: write your ideas for calming things down here</w:t>
             </w:r>

</xml_diff>

<commit_message>
Module 9 : nouvelle question 1 (relire le bilan dans Notre Pacte, module le plus marquant)
Co-Authored-By: Claude Opus 5.5 <noreply@anthropic.com>
Claude-Session: https://claude.ai/code/session_012mXc7jW6jsaFWUdreJine4
</commit_message>
<xml_diff>
--- a/docs/YES-BOX-questions-FR-EN.docx
+++ b/docs/YES-BOX-questions-FR-EN.docx
@@ -12194,32 +12194,32 @@
               <w:spacing w:after="80"/>
             </w:pPr>
             <w:r>
-              <w:t xml:space="preserve">Regarder le chemin — Relis ton journal et vos réponses de bilan : qu'est-ce qui a déjà changé entre vous depuis le début du programme ?</w:t>
-            </w:r>
-          </w:p>
-        </w:tc>
-        <w:tc>
-          <w:tcPr>
-            <w:tcW w:type="dxa" w:w="4559"/>
-            <w:tcBorders>
-              <w:top w:val="single" w:color="D9D2CA" w:sz="4"/>
-              <w:left w:val="single" w:color="D9D2CA" w:sz="4"/>
-              <w:bottom w:val="single" w:color="D9D2CA" w:sz="4"/>
-              <w:right w:val="single" w:color="D9D2CA" w:sz="4"/>
-            </w:tcBorders>
-            <w:tcMar>
-              <w:top w:type="dxa" w:w="80"/>
-              <w:left w:type="dxa" w:w="120"/>
-              <w:bottom w:type="dxa" w:w="80"/>
-              <w:right w:type="dxa" w:w="120"/>
-            </w:tcMar>
-          </w:tcPr>
-          <w:p>
-            <w:pPr>
-              <w:spacing w:after="80"/>
-            </w:pPr>
-            <w:r>
-              <w:t xml:space="preserve">Looking back on the path — Reread your journal and your end-of-module answers: what has already changed between you since the start of the program?</w:t>
+              <w:t>Pour commencer, rends-toi dans l'onglet NOTRE PACTE et relis vos réponses de bilan, puis reviens ici et indique le module avec lequel tu as le plus appris sur l'autre.</w:t>
+            </w:r>
+          </w:p>
+        </w:tc>
+        <w:tc>
+          <w:tcPr>
+            <w:tcW w:type="dxa" w:w="4559"/>
+            <w:tcBorders>
+              <w:top w:val="single" w:color="D9D2CA" w:sz="4"/>
+              <w:left w:val="single" w:color="D9D2CA" w:sz="4"/>
+              <w:bottom w:val="single" w:color="D9D2CA" w:sz="4"/>
+              <w:right w:val="single" w:color="D9D2CA" w:sz="4"/>
+            </w:tcBorders>
+            <w:tcMar>
+              <w:top w:type="dxa" w:w="80"/>
+              <w:left w:type="dxa" w:w="120"/>
+              <w:bottom w:type="dxa" w:w="80"/>
+              <w:right w:type="dxa" w:w="120"/>
+            </w:tcMar>
+          </w:tcPr>
+          <w:p>
+            <w:pPr>
+              <w:spacing w:after="80"/>
+            </w:pPr>
+            <w:r>
+              <w:t>To begin, go to the OUR PACT tab and reread your end-of-module answers, then come back here and tell us which module taught you the most about your partner.</w:t>
             </w:r>
           </w:p>
         </w:tc>

</xml_diff>

<commit_message>
Module 3 : nouvelles questions de fin de module ; Module 9 : question 1 en liste des modules
- Module 3 : « Que voulez-vous changer dans votre quotidien ? » et
  « Qu'est-ce qui vous a surpris·es dans ce module ? Que retenez-vous ? »
- Module 9 : la question 1 propose de choisir un des modules 1 à 8
- Une ancienne réponse en texte libre à une question devenue « choix »
  reste affichée telle quelle
- Documents Word des questions mis à jour

Co-Authored-By: Claude Opus 5.5 <noreply@anthropic.com>
Claude-Session: https://claude.ai/code/session_012mXc7jW6jsaFWUdreJine4
</commit_message>
<xml_diff>
--- a/docs/YES-BOX-questions-FR-EN.docx
+++ b/docs/YES-BOX-questions-FR-EN.docx
@@ -4383,32 +4383,32 @@
               <w:spacing w:after="80"/>
             </w:pPr>
             <w:r>
-              <w:t xml:space="preserve">En comparant vos tableaux, qu'est-ce qui différait entre ta perception et celle de l'autre ?</w:t>
-            </w:r>
-          </w:p>
-        </w:tc>
-        <w:tc>
-          <w:tcPr>
-            <w:tcW w:type="dxa" w:w="4559"/>
-            <w:tcBorders>
-              <w:top w:val="single" w:color="D9D2CA" w:sz="4"/>
-              <w:left w:val="single" w:color="D9D2CA" w:sz="4"/>
-              <w:bottom w:val="single" w:color="D9D2CA" w:sz="4"/>
-              <w:right w:val="single" w:color="D9D2CA" w:sz="4"/>
-            </w:tcBorders>
-            <w:tcMar>
-              <w:top w:type="dxa" w:w="80"/>
-              <w:left w:type="dxa" w:w="120"/>
-              <w:bottom w:type="dxa" w:w="80"/>
-              <w:right w:type="dxa" w:w="120"/>
-            </w:tcMar>
-          </w:tcPr>
-          <w:p>
-            <w:pPr>
-              <w:spacing w:after="80"/>
-            </w:pPr>
-            <w:r>
-              <w:t xml:space="preserve">Comparing your grids, what differed between your perception and your partner's?</w:t>
+              <w:t>Que voulez-vous changer dans votre quotidien ?</w:t>
+            </w:r>
+          </w:p>
+        </w:tc>
+        <w:tc>
+          <w:tcPr>
+            <w:tcW w:type="dxa" w:w="4559"/>
+            <w:tcBorders>
+              <w:top w:val="single" w:color="D9D2CA" w:sz="4"/>
+              <w:left w:val="single" w:color="D9D2CA" w:sz="4"/>
+              <w:bottom w:val="single" w:color="D9D2CA" w:sz="4"/>
+              <w:right w:val="single" w:color="D9D2CA" w:sz="4"/>
+            </w:tcBorders>
+            <w:tcMar>
+              <w:top w:type="dxa" w:w="80"/>
+              <w:left w:type="dxa" w:w="120"/>
+              <w:bottom w:type="dxa" w:w="80"/>
+              <w:right w:type="dxa" w:w="120"/>
+            </w:tcMar>
+          </w:tcPr>
+          <w:p>
+            <w:pPr>
+              <w:spacing w:after="80"/>
+            </w:pPr>
+            <w:r>
+              <w:t>What do you want to change in your everyday life?</w:t>
             </w:r>
           </w:p>
         </w:tc>
@@ -4463,32 +4463,32 @@
               <w:spacing w:after="80"/>
             </w:pPr>
             <w:r>
-              <w:t xml:space="preserve">Quel point de votre organisation aimerais-tu voir figurer dans le pacte, à garder tel quel ou à revoir ?</w:t>
-            </w:r>
-          </w:p>
-        </w:tc>
-        <w:tc>
-          <w:tcPr>
-            <w:tcW w:type="dxa" w:w="4559"/>
-            <w:tcBorders>
-              <w:top w:val="single" w:color="D9D2CA" w:sz="4"/>
-              <w:left w:val="single" w:color="D9D2CA" w:sz="4"/>
-              <w:bottom w:val="single" w:color="D9D2CA" w:sz="4"/>
-              <w:right w:val="single" w:color="D9D2CA" w:sz="4"/>
-            </w:tcBorders>
-            <w:tcMar>
-              <w:top w:type="dxa" w:w="80"/>
-              <w:left w:type="dxa" w:w="120"/>
-              <w:bottom w:type="dxa" w:w="80"/>
-              <w:right w:type="dxa" w:w="120"/>
-            </w:tcMar>
-          </w:tcPr>
-          <w:p>
-            <w:pPr>
-              <w:spacing w:after="80"/>
-            </w:pPr>
-            <w:r>
-              <w:t xml:space="preserve">Which aspect of how you organize things would you like to see in the pact, to keep as is or to rethink?</w:t>
+              <w:t>Qu'est-ce qui vous a surpris·es dans ce module ? Que retenez-vous ?</w:t>
+            </w:r>
+          </w:p>
+        </w:tc>
+        <w:tc>
+          <w:tcPr>
+            <w:tcW w:type="dxa" w:w="4559"/>
+            <w:tcBorders>
+              <w:top w:val="single" w:color="D9D2CA" w:sz="4"/>
+              <w:left w:val="single" w:color="D9D2CA" w:sz="4"/>
+              <w:bottom w:val="single" w:color="D9D2CA" w:sz="4"/>
+              <w:right w:val="single" w:color="D9D2CA" w:sz="4"/>
+            </w:tcBorders>
+            <w:tcMar>
+              <w:top w:type="dxa" w:w="80"/>
+              <w:left w:type="dxa" w:w="120"/>
+              <w:bottom w:type="dxa" w:w="80"/>
+              <w:right w:type="dxa" w:w="120"/>
+            </w:tcMar>
+          </w:tcPr>
+          <w:p>
+            <w:pPr>
+              <w:spacing w:after="80"/>
+            </w:pPr>
+            <w:r>
+              <w:t>What surprised you in this module? What will you take away from it?</w:t>
             </w:r>
           </w:p>
         </w:tc>
@@ -12195,6 +12195,22 @@
             </w:pPr>
             <w:r>
               <w:t>Pour commencer, rends-toi dans l'onglet NOTRE PACTE et relis vos réponses de bilan, puis reviens ici et indique le module avec lequel tu as le plus appris sur l'autre.</w:t>
+              <w:br/>
+              <w:t>○ Module 1 — Toi et Moi</w:t>
+              <w:br/>
+              <w:t>○ Module 2 — Nous</w:t>
+              <w:br/>
+              <w:t>○ Module 3 — Le quotidien</w:t>
+              <w:br/>
+              <w:t>○ Module 4 — Argent et projets</w:t>
+              <w:br/>
+              <w:t>○ Module 5 — Famille et croyances</w:t>
+              <w:br/>
+              <w:t>○ Module 6 — Gestion des émotions et communication</w:t>
+              <w:br/>
+              <w:t>○ Module 7 — Tendresse et intimité</w:t>
+              <w:br/>
+              <w:t>○ Module 8 — Les disputes</w:t>
             </w:r>
           </w:p>
         </w:tc>
@@ -12220,6 +12236,22 @@
             </w:pPr>
             <w:r>
               <w:t>To begin, go to the OUR PACT tab and reread your end-of-module answers, then come back here and tell us which module taught you the most about your partner.</w:t>
+              <w:br/>
+              <w:t>○ Module 1 — You and Me</w:t>
+              <w:br/>
+              <w:t>○ Module 2 — Us</w:t>
+              <w:br/>
+              <w:t>○ Module 3 — Everyday Life</w:t>
+              <w:br/>
+              <w:t>○ Module 4 — Money and plans</w:t>
+              <w:br/>
+              <w:t>○ Module 5 — Family and beliefs</w:t>
+              <w:br/>
+              <w:t>○ Module 6 — Managing emotions and communication</w:t>
+              <w:br/>
+              <w:t>○ Module 7 — Tenderness and Intimacy</w:t>
+              <w:br/>
+              <w:t>○ Module 8 — Arguments</w:t>
             </w:r>
           </w:p>
         </w:tc>

</xml_diff>

<commit_message>
Module 9 : nouvelles questions ; Notre Pacte : message d'attente du pacte
- Module 9 : 10 questions (modules qui ont le plus appris sur l'autre en
  choix multiple, gratitude « MERCI… », engagements, mot-clé, projet,
  rituel, année réussie) ; question de date reformulée avec « voulez-vous »
- Notre Pacte : « Votre pacte s'affichera ici quand vous aurez terminé le
  programme » tant que le module 9 n'est pas terminé ; l'espace d'écriture
  du pacte n'apparaît qu'ensuite (ou s'il contient déjà un texte)
- Documents Word mis à jour (Module 9, nombre de questions des modules 8 et 9)

Co-Authored-By: Claude Opus 5.5 <noreply@anthropic.com>
Claude-Session: https://claude.ai/code/session_012mXc7jW6jsaFWUdreJine4
</commit_message>
<xml_diff>
--- a/docs/YES-BOX-questions-FR-EN.docx
+++ b/docs/YES-BOX-questions-FR-EN.docx
@@ -10541,7 +10541,7 @@
         <w:pStyle w:val="Heading2"/>
       </w:pPr>
       <w:r>
-        <w:t>Questions (13)</w:t>
+        <w:t>Questions (12)</w:t>
       </w:r>
     </w:p>
     <w:tbl>
@@ -12026,7 +12026,7 @@
         <w:pStyle w:val="Heading2"/>
       </w:pPr>
       <w:r>
-        <w:t xml:space="preserve">Questions (15)</w:t>
+        <w:t>Questions (10)</w:t>
       </w:r>
     </w:p>
     <w:tbl>
@@ -12194,64 +12194,68 @@
               <w:spacing w:after="80"/>
             </w:pPr>
             <w:r>
-              <w:t>Pour commencer, rends-toi dans l'onglet NOTRE PACTE et relis vos réponses de bilan, puis reviens ici et indique le module avec lequel tu as le plus appris sur l'autre.</w:t>
+              <w:t>Pour commencer, rends-toi dans l'onglet NOTRE PACTE et relis vos réponses de bilan, puis reviens ici et indique le ou les modules qui t'ont permis d'apprendre le plus sur l'autre.</w:t>
               <w:br/>
-              <w:t>○ Module 1 — Toi et Moi</w:t>
+              <w:t>(plusieurs choix possibles)</w:t>
               <w:br/>
-              <w:t>○ Module 2 — Nous</w:t>
+              <w:t>☐ Module 1 — Toi et Moi</w:t>
               <w:br/>
-              <w:t>○ Module 3 — Le quotidien</w:t>
+              <w:t>☐ Module 2 — Nous</w:t>
               <w:br/>
-              <w:t>○ Module 4 — Argent et projets</w:t>
+              <w:t>☐ Module 3 — Le quotidien</w:t>
               <w:br/>
-              <w:t>○ Module 5 — Famille et croyances</w:t>
+              <w:t>☐ Module 4 — Argent et projets</w:t>
               <w:br/>
-              <w:t>○ Module 6 — Gestion des émotions et communication</w:t>
+              <w:t>☐ Module 5 — Famille et croyances</w:t>
               <w:br/>
-              <w:t>○ Module 7 — Tendresse et intimité</w:t>
+              <w:t>☐ Module 6 — Gestion des émotions et communication</w:t>
               <w:br/>
-              <w:t>○ Module 8 — Les disputes</w:t>
-            </w:r>
-          </w:p>
-        </w:tc>
-        <w:tc>
-          <w:tcPr>
-            <w:tcW w:type="dxa" w:w="4559"/>
-            <w:tcBorders>
-              <w:top w:val="single" w:color="D9D2CA" w:sz="4"/>
-              <w:left w:val="single" w:color="D9D2CA" w:sz="4"/>
-              <w:bottom w:val="single" w:color="D9D2CA" w:sz="4"/>
-              <w:right w:val="single" w:color="D9D2CA" w:sz="4"/>
-            </w:tcBorders>
-            <w:tcMar>
-              <w:top w:type="dxa" w:w="80"/>
-              <w:left w:type="dxa" w:w="120"/>
-              <w:bottom w:type="dxa" w:w="80"/>
-              <w:right w:type="dxa" w:w="120"/>
-            </w:tcMar>
-          </w:tcPr>
-          <w:p>
-            <w:pPr>
-              <w:spacing w:after="80"/>
-            </w:pPr>
-            <w:r>
-              <w:t>To begin, go to the OUR PACT tab and reread your end-of-module answers, then come back here and tell us which module taught you the most about your partner.</w:t>
+              <w:t>☐ Module 7 — Tendresse et intimité</w:t>
               <w:br/>
-              <w:t>○ Module 1 — You and Me</w:t>
+              <w:t>☐ Module 8 — Les disputes</w:t>
+            </w:r>
+          </w:p>
+        </w:tc>
+        <w:tc>
+          <w:tcPr>
+            <w:tcW w:type="dxa" w:w="4559"/>
+            <w:tcBorders>
+              <w:top w:val="single" w:color="D9D2CA" w:sz="4"/>
+              <w:left w:val="single" w:color="D9D2CA" w:sz="4"/>
+              <w:bottom w:val="single" w:color="D9D2CA" w:sz="4"/>
+              <w:right w:val="single" w:color="D9D2CA" w:sz="4"/>
+            </w:tcBorders>
+            <w:tcMar>
+              <w:top w:type="dxa" w:w="80"/>
+              <w:left w:type="dxa" w:w="120"/>
+              <w:bottom w:type="dxa" w:w="80"/>
+              <w:right w:type="dxa" w:w="120"/>
+            </w:tcMar>
+          </w:tcPr>
+          <w:p>
+            <w:pPr>
+              <w:spacing w:after="80"/>
+            </w:pPr>
+            <w:r>
+              <w:t>To begin, go to the OUR PACT tab and reread your end-of-module answers, then come back here and tell us which module or modules taught you the most about your partner.</w:t>
               <w:br/>
-              <w:t>○ Module 2 — Us</w:t>
+              <w:t>(several choices possible)</w:t>
               <w:br/>
-              <w:t>○ Module 3 — Everyday Life</w:t>
+              <w:t>☐ Module 1 — You and Me</w:t>
               <w:br/>
-              <w:t>○ Module 4 — Money and plans</w:t>
+              <w:t>☐ Module 2 — Us</w:t>
               <w:br/>
-              <w:t>○ Module 5 — Family and beliefs</w:t>
+              <w:t>☐ Module 3 — Everyday Life</w:t>
               <w:br/>
-              <w:t>○ Module 6 — Managing emotions and communication</w:t>
+              <w:t>☐ Module 4 — Money and plans</w:t>
               <w:br/>
-              <w:t>○ Module 7 — Tenderness and Intimacy</w:t>
+              <w:t>☐ Module 5 — Family and beliefs</w:t>
               <w:br/>
-              <w:t>○ Module 8 — Arguments</w:t>
+              <w:t>☐ Module 6 — Managing emotions and communication</w:t>
+              <w:br/>
+              <w:t>☐ Module 7 — Tenderness and Intimacy</w:t>
+              <w:br/>
+              <w:t>☐ Module 8 — Arguments</w:t>
             </w:r>
           </w:p>
         </w:tc>
@@ -12308,33 +12312,37 @@
               <w:spacing w:after="80"/>
             </w:pPr>
             <w:r>
-              <w:t xml:space="preserve">À quel sujet éprouves-tu de la gratitude envers l'autre ?</w:t>
-            </w:r>
-          </w:p>
-        </w:tc>
-        <w:tc>
-          <w:tcPr>
-            <w:tcW w:type="dxa" w:w="4559"/>
-            <w:tcBorders>
-              <w:top w:val="single" w:color="D9D2CA" w:sz="4"/>
-              <w:left w:val="single" w:color="D9D2CA" w:sz="4"/>
-              <w:bottom w:val="single" w:color="D9D2CA" w:sz="4"/>
-              <w:right w:val="single" w:color="D9D2CA" w:sz="4"/>
-            </w:tcBorders>
-            <w:shd w:fill="FBF8F3" w:color="auto" w:val="clear"/>
-            <w:tcMar>
-              <w:top w:type="dxa" w:w="80"/>
-              <w:left w:type="dxa" w:w="120"/>
-              <w:bottom w:type="dxa" w:w="80"/>
-              <w:right w:type="dxa" w:w="120"/>
-            </w:tcMar>
-          </w:tcPr>
-          <w:p>
-            <w:pPr>
-              <w:spacing w:after="80"/>
-            </w:pPr>
-            <w:r>
-              <w:t xml:space="preserve">What are you grateful to your partner for?</w:t>
+              <w:t>À quel sujet éprouves-tu de la gratitude envers l'autre ? Pourquoi aimerais-tu lui dire MERCI ?</w:t>
+              <w:br/>
+              <w:t>Commence ta phrase par « MERCI… »</w:t>
+            </w:r>
+          </w:p>
+        </w:tc>
+        <w:tc>
+          <w:tcPr>
+            <w:tcW w:type="dxa" w:w="4559"/>
+            <w:tcBorders>
+              <w:top w:val="single" w:color="D9D2CA" w:sz="4"/>
+              <w:left w:val="single" w:color="D9D2CA" w:sz="4"/>
+              <w:bottom w:val="single" w:color="D9D2CA" w:sz="4"/>
+              <w:right w:val="single" w:color="D9D2CA" w:sz="4"/>
+            </w:tcBorders>
+            <w:shd w:fill="FBF8F3" w:color="auto" w:val="clear"/>
+            <w:tcMar>
+              <w:top w:type="dxa" w:w="80"/>
+              <w:left w:type="dxa" w:w="120"/>
+              <w:bottom w:type="dxa" w:w="80"/>
+              <w:right w:type="dxa" w:w="120"/>
+            </w:tcMar>
+          </w:tcPr>
+          <w:p>
+            <w:pPr>
+              <w:spacing w:after="80"/>
+            </w:pPr>
+            <w:r>
+              <w:t>What are you grateful to your partner for? Why would you like to say THANK YOU to them?</w:t>
+              <w:br/>
+              <w:t>Start your sentence with "THANK YOU…"</w:t>
             </w:r>
           </w:p>
         </w:tc>
@@ -12389,32 +12397,32 @@
               <w:spacing w:after="80"/>
             </w:pPr>
             <w:r>
-              <w:t xml:space="preserve">Votre socle — Selon toi, quels sont les 3 principes de base d'un couple heureux… et du vôtre en particulier ?</w:t>
-            </w:r>
-          </w:p>
-        </w:tc>
-        <w:tc>
-          <w:tcPr>
-            <w:tcW w:type="dxa" w:w="4559"/>
-            <w:tcBorders>
-              <w:top w:val="single" w:color="D9D2CA" w:sz="4"/>
-              <w:left w:val="single" w:color="D9D2CA" w:sz="4"/>
-              <w:bottom w:val="single" w:color="D9D2CA" w:sz="4"/>
-              <w:right w:val="single" w:color="D9D2CA" w:sz="4"/>
-            </w:tcBorders>
-            <w:tcMar>
-              <w:top w:type="dxa" w:w="80"/>
-              <w:left w:type="dxa" w:w="120"/>
-              <w:bottom w:type="dxa" w:w="80"/>
-              <w:right w:type="dxa" w:w="120"/>
-            </w:tcMar>
-          </w:tcPr>
-          <w:p>
-            <w:pPr>
-              <w:spacing w:after="80"/>
-            </w:pPr>
-            <w:r>
-              <w:t xml:space="preserve">Your foundation — In your view, what are the 3 core principles of a happy couple… and of yours in particular?</w:t>
+              <w:t>Selon toi, quels sont les 3 principes de base d'un couple heureux… et du vôtre en particulier ?</w:t>
+            </w:r>
+          </w:p>
+        </w:tc>
+        <w:tc>
+          <w:tcPr>
+            <w:tcW w:type="dxa" w:w="4559"/>
+            <w:tcBorders>
+              <w:top w:val="single" w:color="D9D2CA" w:sz="4"/>
+              <w:left w:val="single" w:color="D9D2CA" w:sz="4"/>
+              <w:bottom w:val="single" w:color="D9D2CA" w:sz="4"/>
+              <w:right w:val="single" w:color="D9D2CA" w:sz="4"/>
+            </w:tcBorders>
+            <w:tcMar>
+              <w:top w:type="dxa" w:w="80"/>
+              <w:left w:type="dxa" w:w="120"/>
+              <w:bottom w:type="dxa" w:w="80"/>
+              <w:right w:type="dxa" w:w="120"/>
+            </w:tcMar>
+          </w:tcPr>
+          <w:p>
+            <w:pPr>
+              <w:spacing w:after="80"/>
+            </w:pPr>
+            <w:r>
+              <w:t>In your view, what are the 3 core principles of a happy couple… and of yours in particular?</w:t>
             </w:r>
           </w:p>
         </w:tc>
@@ -12471,33 +12479,33 @@
               <w:spacing w:after="80"/>
             </w:pPr>
             <w:r>
-              <w:t xml:space="preserve">Que veut dire pour toi « s'engager » ?</w:t>
-            </w:r>
-          </w:p>
-        </w:tc>
-        <w:tc>
-          <w:tcPr>
-            <w:tcW w:type="dxa" w:w="4559"/>
-            <w:tcBorders>
-              <w:top w:val="single" w:color="D9D2CA" w:sz="4"/>
-              <w:left w:val="single" w:color="D9D2CA" w:sz="4"/>
-              <w:bottom w:val="single" w:color="D9D2CA" w:sz="4"/>
-              <w:right w:val="single" w:color="D9D2CA" w:sz="4"/>
-            </w:tcBorders>
-            <w:shd w:fill="FBF8F3" w:color="auto" w:val="clear"/>
-            <w:tcMar>
-              <w:top w:type="dxa" w:w="80"/>
-              <w:left w:type="dxa" w:w="120"/>
-              <w:bottom w:type="dxa" w:w="80"/>
-              <w:right w:type="dxa" w:w="120"/>
-            </w:tcMar>
-          </w:tcPr>
-          <w:p>
-            <w:pPr>
-              <w:spacing w:after="80"/>
-            </w:pPr>
-            <w:r>
-              <w:t xml:space="preserve">What does "committing" mean to you?</w:t>
+              <w:t>Quelle est pour toi la plus grande preuve d'engagement dans un couple ?</w:t>
+            </w:r>
+          </w:p>
+        </w:tc>
+        <w:tc>
+          <w:tcPr>
+            <w:tcW w:type="dxa" w:w="4559"/>
+            <w:tcBorders>
+              <w:top w:val="single" w:color="D9D2CA" w:sz="4"/>
+              <w:left w:val="single" w:color="D9D2CA" w:sz="4"/>
+              <w:bottom w:val="single" w:color="D9D2CA" w:sz="4"/>
+              <w:right w:val="single" w:color="D9D2CA" w:sz="4"/>
+            </w:tcBorders>
+            <w:shd w:fill="FBF8F3" w:color="auto" w:val="clear"/>
+            <w:tcMar>
+              <w:top w:type="dxa" w:w="80"/>
+              <w:left w:type="dxa" w:w="120"/>
+              <w:bottom w:type="dxa" w:w="80"/>
+              <w:right w:type="dxa" w:w="120"/>
+            </w:tcMar>
+          </w:tcPr>
+          <w:p>
+            <w:pPr>
+              <w:spacing w:after="80"/>
+            </w:pPr>
+            <w:r>
+              <w:t>To you, what is the greatest proof of commitment in a relationship?</w:t>
             </w:r>
           </w:p>
         </w:tc>
@@ -12552,32 +12560,32 @@
               <w:spacing w:after="80"/>
             </w:pPr>
             <w:r>
-              <w:t xml:space="preserve">Vos désaccords — En relisant vos réponses aux différents modules, où ne coïncident-elles pas ? Classe ces désaccords : négociable, pas encore réfléchi, rédhibitoire.</w:t>
-            </w:r>
-          </w:p>
-        </w:tc>
-        <w:tc>
-          <w:tcPr>
-            <w:tcW w:type="dxa" w:w="4559"/>
-            <w:tcBorders>
-              <w:top w:val="single" w:color="D9D2CA" w:sz="4"/>
-              <w:left w:val="single" w:color="D9D2CA" w:sz="4"/>
-              <w:bottom w:val="single" w:color="D9D2CA" w:sz="4"/>
-              <w:right w:val="single" w:color="D9D2CA" w:sz="4"/>
-            </w:tcBorders>
-            <w:tcMar>
-              <w:top w:type="dxa" w:w="80"/>
-              <w:left w:type="dxa" w:w="120"/>
-              <w:bottom w:type="dxa" w:w="80"/>
-              <w:right w:type="dxa" w:w="120"/>
-            </w:tcMar>
-          </w:tcPr>
-          <w:p>
-            <w:pPr>
-              <w:spacing w:after="80"/>
-            </w:pPr>
-            <w:r>
-              <w:t xml:space="preserve">Your disagreements — Rereading your answers across the modules, where do they not match? Sort these disagreements: negotiable, not yet thought through, dealbreaker.</w:t>
+              <w:t>Écris ici la chose que tu t'engages à faire (ou à faire plus souvent) pour l'autre cette année.</w:t>
+            </w:r>
+          </w:p>
+        </w:tc>
+        <w:tc>
+          <w:tcPr>
+            <w:tcW w:type="dxa" w:w="4559"/>
+            <w:tcBorders>
+              <w:top w:val="single" w:color="D9D2CA" w:sz="4"/>
+              <w:left w:val="single" w:color="D9D2CA" w:sz="4"/>
+              <w:bottom w:val="single" w:color="D9D2CA" w:sz="4"/>
+              <w:right w:val="single" w:color="D9D2CA" w:sz="4"/>
+            </w:tcBorders>
+            <w:tcMar>
+              <w:top w:type="dxa" w:w="80"/>
+              <w:left w:type="dxa" w:w="120"/>
+              <w:bottom w:type="dxa" w:w="80"/>
+              <w:right w:type="dxa" w:w="120"/>
+            </w:tcMar>
+          </w:tcPr>
+          <w:p>
+            <w:pPr>
+              <w:spacing w:after="80"/>
+            </w:pPr>
+            <w:r>
+              <w:t>Write down the one thing you commit to doing (or doing more often) for your partner this year.</w:t>
             </w:r>
           </w:p>
         </w:tc>
@@ -12634,33 +12642,33 @@
               <w:spacing w:after="80"/>
             </w:pPr>
             <w:r>
-              <w:t xml:space="preserve">Parmi ces désaccords, lequel acceptes-tu de laisser tel quel, sans chercher à le résoudre à tout prix ?</w:t>
-            </w:r>
-          </w:p>
-        </w:tc>
-        <w:tc>
-          <w:tcPr>
-            <w:tcW w:type="dxa" w:w="4559"/>
-            <w:tcBorders>
-              <w:top w:val="single" w:color="D9D2CA" w:sz="4"/>
-              <w:left w:val="single" w:color="D9D2CA" w:sz="4"/>
-              <w:bottom w:val="single" w:color="D9D2CA" w:sz="4"/>
-              <w:right w:val="single" w:color="D9D2CA" w:sz="4"/>
-            </w:tcBorders>
-            <w:shd w:fill="FBF8F3" w:color="auto" w:val="clear"/>
-            <w:tcMar>
-              <w:top w:type="dxa" w:w="80"/>
-              <w:left w:type="dxa" w:w="120"/>
-              <w:bottom w:type="dxa" w:w="80"/>
-              <w:right w:type="dxa" w:w="120"/>
-            </w:tcMar>
-          </w:tcPr>
-          <w:p>
-            <w:pPr>
-              <w:spacing w:after="80"/>
-            </w:pPr>
-            <w:r>
-              <w:t xml:space="preserve">Among these disagreements, which one are you willing to leave as it is, without trying to resolve it at all costs?</w:t>
+              <w:t>Et une chose à laquelle tu renonces, ou que tu t'engages à faire moins.</w:t>
+            </w:r>
+          </w:p>
+        </w:tc>
+        <w:tc>
+          <w:tcPr>
+            <w:tcW w:type="dxa" w:w="4559"/>
+            <w:tcBorders>
+              <w:top w:val="single" w:color="D9D2CA" w:sz="4"/>
+              <w:left w:val="single" w:color="D9D2CA" w:sz="4"/>
+              <w:bottom w:val="single" w:color="D9D2CA" w:sz="4"/>
+              <w:right w:val="single" w:color="D9D2CA" w:sz="4"/>
+            </w:tcBorders>
+            <w:shd w:fill="FBF8F3" w:color="auto" w:val="clear"/>
+            <w:tcMar>
+              <w:top w:type="dxa" w:w="80"/>
+              <w:left w:type="dxa" w:w="120"/>
+              <w:bottom w:type="dxa" w:w="80"/>
+              <w:right w:type="dxa" w:w="120"/>
+            </w:tcMar>
+          </w:tcPr>
+          <w:p>
+            <w:pPr>
+              <w:spacing w:after="80"/>
+            </w:pPr>
+            <w:r>
+              <w:t>And one thing you give up, or commit to doing less.</w:t>
             </w:r>
           </w:p>
         </w:tc>
@@ -12715,32 +12723,32 @@
               <w:spacing w:after="80"/>
             </w:pPr>
             <w:r>
-              <w:t xml:space="preserve">Nos règles du quotidien : classez ensemble ce qui est indispensable, important, négociable ou modifiable (tâches, temps à deux, temps pour soi, argent, famille, écrans…).</w:t>
-            </w:r>
-          </w:p>
-        </w:tc>
-        <w:tc>
-          <w:tcPr>
-            <w:tcW w:type="dxa" w:w="4559"/>
-            <w:tcBorders>
-              <w:top w:val="single" w:color="D9D2CA" w:sz="4"/>
-              <w:left w:val="single" w:color="D9D2CA" w:sz="4"/>
-              <w:bottom w:val="single" w:color="D9D2CA" w:sz="4"/>
-              <w:right w:val="single" w:color="D9D2CA" w:sz="4"/>
-            </w:tcBorders>
-            <w:tcMar>
-              <w:top w:type="dxa" w:w="80"/>
-              <w:left w:type="dxa" w:w="120"/>
-              <w:bottom w:type="dxa" w:w="80"/>
-              <w:right w:type="dxa" w:w="120"/>
-            </w:tcMar>
-          </w:tcPr>
-          <w:p>
-            <w:pPr>
-              <w:spacing w:after="80"/>
-            </w:pPr>
-            <w:r>
-              <w:t xml:space="preserve">Our everyday rules: sort together what is essential, important, negotiable or changeable (chores, time together, time for yourself, money, family, screens…).</w:t>
+              <w:t>Quel pourrait être le mot-clé de votre année à venir ?</w:t>
+            </w:r>
+          </w:p>
+        </w:tc>
+        <w:tc>
+          <w:tcPr>
+            <w:tcW w:type="dxa" w:w="4559"/>
+            <w:tcBorders>
+              <w:top w:val="single" w:color="D9D2CA" w:sz="4"/>
+              <w:left w:val="single" w:color="D9D2CA" w:sz="4"/>
+              <w:bottom w:val="single" w:color="D9D2CA" w:sz="4"/>
+              <w:right w:val="single" w:color="D9D2CA" w:sz="4"/>
+            </w:tcBorders>
+            <w:tcMar>
+              <w:top w:type="dxa" w:w="80"/>
+              <w:left w:type="dxa" w:w="120"/>
+              <w:bottom w:type="dxa" w:w="80"/>
+              <w:right w:type="dxa" w:w="120"/>
+            </w:tcMar>
+          </w:tcPr>
+          <w:p>
+            <w:pPr>
+              <w:spacing w:after="80"/>
+            </w:pPr>
+            <w:r>
+              <w:t>What could be the keyword for your year ahead?</w:t>
             </w:r>
           </w:p>
         </w:tc>
@@ -12797,33 +12805,33 @@
               <w:spacing w:after="80"/>
             </w:pPr>
             <w:r>
-              <w:t xml:space="preserve">Nos engagements de communication : quelles 3 habitudes veux-tu garder ou adopter (code secret, rendez-vous de discussion, écoute sans interrompre…) ?</w:t>
-            </w:r>
-          </w:p>
-        </w:tc>
-        <w:tc>
-          <w:tcPr>
-            <w:tcW w:type="dxa" w:w="4559"/>
-            <w:tcBorders>
-              <w:top w:val="single" w:color="D9D2CA" w:sz="4"/>
-              <w:left w:val="single" w:color="D9D2CA" w:sz="4"/>
-              <w:bottom w:val="single" w:color="D9D2CA" w:sz="4"/>
-              <w:right w:val="single" w:color="D9D2CA" w:sz="4"/>
-            </w:tcBorders>
-            <w:shd w:fill="FBF8F3" w:color="auto" w:val="clear"/>
-            <w:tcMar>
-              <w:top w:type="dxa" w:w="80"/>
-              <w:left w:type="dxa" w:w="120"/>
-              <w:bottom w:type="dxa" w:w="80"/>
-              <w:right w:type="dxa" w:w="120"/>
-            </w:tcMar>
-          </w:tcPr>
-          <w:p>
-            <w:pPr>
-              <w:spacing w:after="80"/>
-            </w:pPr>
-            <w:r>
-              <w:t xml:space="preserve">Our communication commitments: which 3 habits do you want to keep or adopt (secret code, regular talk dates, listening without interrupting…)?</w:t>
+              <w:t>Y a-t-il un projet de couple que vous voulez vous fixer cette année ? (petit ou grand, commun ou un rêve de l'autre à soutenir)</w:t>
+            </w:r>
+          </w:p>
+        </w:tc>
+        <w:tc>
+          <w:tcPr>
+            <w:tcW w:type="dxa" w:w="4559"/>
+            <w:tcBorders>
+              <w:top w:val="single" w:color="D9D2CA" w:sz="4"/>
+              <w:left w:val="single" w:color="D9D2CA" w:sz="4"/>
+              <w:bottom w:val="single" w:color="D9D2CA" w:sz="4"/>
+              <w:right w:val="single" w:color="D9D2CA" w:sz="4"/>
+            </w:tcBorders>
+            <w:shd w:fill="FBF8F3" w:color="auto" w:val="clear"/>
+            <w:tcMar>
+              <w:top w:type="dxa" w:w="80"/>
+              <w:left w:type="dxa" w:w="120"/>
+              <w:bottom w:type="dxa" w:w="80"/>
+              <w:right w:type="dxa" w:w="120"/>
+            </w:tcMar>
+          </w:tcPr>
+          <w:p>
+            <w:pPr>
+              <w:spacing w:after="80"/>
+            </w:pPr>
+            <w:r>
+              <w:t>Is there a couple's project you want to set for yourselves this year? (big or small, shared or a dream of your partner's to support)</w:t>
             </w:r>
           </w:p>
         </w:tc>
@@ -12878,32 +12886,36 @@
               <w:spacing w:after="80"/>
             </w:pPr>
             <w:r>
-              <w:t xml:space="preserve">Notre charte de dispute : quelles pourraient être vos 3 règles d'or pour l'année ?</w:t>
-            </w:r>
-          </w:p>
-        </w:tc>
-        <w:tc>
-          <w:tcPr>
-            <w:tcW w:type="dxa" w:w="4559"/>
-            <w:tcBorders>
-              <w:top w:val="single" w:color="D9D2CA" w:sz="4"/>
-              <w:left w:val="single" w:color="D9D2CA" w:sz="4"/>
-              <w:bottom w:val="single" w:color="D9D2CA" w:sz="4"/>
-              <w:right w:val="single" w:color="D9D2CA" w:sz="4"/>
-            </w:tcBorders>
-            <w:tcMar>
-              <w:top w:type="dxa" w:w="80"/>
-              <w:left w:type="dxa" w:w="120"/>
-              <w:bottom w:type="dxa" w:w="80"/>
-              <w:right w:type="dxa" w:w="120"/>
-            </w:tcMar>
-          </w:tcPr>
-          <w:p>
-            <w:pPr>
-              <w:spacing w:after="80"/>
-            </w:pPr>
-            <w:r>
-              <w:t xml:space="preserve">Our argument charter: what could your 3 golden rules be for the year?</w:t>
+              <w:t>Avant votre rendez-vous bilan dans 1 an, voulez-vous définir un rituel de couple (sortie en tête-à-tête, petits mots doux…) ?</w:t>
+              <w:br/>
+              <w:t>À quelle fréquence, sous quelle forme ?</w:t>
+            </w:r>
+          </w:p>
+        </w:tc>
+        <w:tc>
+          <w:tcPr>
+            <w:tcW w:type="dxa" w:w="4559"/>
+            <w:tcBorders>
+              <w:top w:val="single" w:color="D9D2CA" w:sz="4"/>
+              <w:left w:val="single" w:color="D9D2CA" w:sz="4"/>
+              <w:bottom w:val="single" w:color="D9D2CA" w:sz="4"/>
+              <w:right w:val="single" w:color="D9D2CA" w:sz="4"/>
+            </w:tcBorders>
+            <w:tcMar>
+              <w:top w:type="dxa" w:w="80"/>
+              <w:left w:type="dxa" w:w="120"/>
+              <w:bottom w:type="dxa" w:w="80"/>
+              <w:right w:type="dxa" w:w="120"/>
+            </w:tcMar>
+          </w:tcPr>
+          <w:p>
+            <w:pPr>
+              <w:spacing w:after="80"/>
+            </w:pPr>
+            <w:r>
+              <w:t>Before your review date in 1 year, would you like to set a couple's ritual (a night out just the two of you, sweet little notes…)?</w:t>
+              <w:br/>
+              <w:t>How often, in what form?</w:t>
             </w:r>
           </w:p>
         </w:tc>
@@ -12960,439 +12972,33 @@
               <w:spacing w:after="80"/>
             </w:pPr>
             <w:r>
-              <w:t xml:space="preserve">Notre projet de l'année, petit ou grand, commun ou un rêve de l'autre à soutenir : quoi, qui fait quoi, pour quand ?</w:t>
-            </w:r>
-          </w:p>
-        </w:tc>
-        <w:tc>
-          <w:tcPr>
-            <w:tcW w:type="dxa" w:w="4559"/>
-            <w:tcBorders>
-              <w:top w:val="single" w:color="D9D2CA" w:sz="4"/>
-              <w:left w:val="single" w:color="D9D2CA" w:sz="4"/>
-              <w:bottom w:val="single" w:color="D9D2CA" w:sz="4"/>
-              <w:right w:val="single" w:color="D9D2CA" w:sz="4"/>
-            </w:tcBorders>
-            <w:shd w:fill="FBF8F3" w:color="auto" w:val="clear"/>
-            <w:tcMar>
-              <w:top w:type="dxa" w:w="80"/>
-              <w:left w:type="dxa" w:w="120"/>
-              <w:bottom w:type="dxa" w:w="80"/>
-              <w:right w:type="dxa" w:w="120"/>
-            </w:tcMar>
-          </w:tcPr>
-          <w:p>
-            <w:pPr>
-              <w:spacing w:after="80"/>
-            </w:pPr>
-            <w:r>
-              <w:t xml:space="preserve">Our project for the year, big or small, shared or a dream of your partner's to support: what, who does what, by when?</w:t>
-            </w:r>
-          </w:p>
-        </w:tc>
-      </w:tr>
-      <w:tr>
-        <w:trPr>
-          <w:cantSplit w:val="false"/>
-        </w:trPr>
-        <w:tc>
-          <w:tcPr>
-            <w:tcW w:type="dxa" w:w="520"/>
-            <w:tcBorders>
-              <w:top w:val="single" w:color="D9D2CA" w:sz="4"/>
-              <w:left w:val="single" w:color="D9D2CA" w:sz="4"/>
-              <w:bottom w:val="single" w:color="D9D2CA" w:sz="4"/>
-              <w:right w:val="single" w:color="D9D2CA" w:sz="4"/>
-            </w:tcBorders>
-            <w:tcMar>
-              <w:top w:type="dxa" w:w="80"/>
-              <w:left w:type="dxa" w:w="120"/>
-              <w:bottom w:type="dxa" w:w="80"/>
-              <w:right w:type="dxa" w:w="120"/>
-            </w:tcMar>
-          </w:tcPr>
-          <w:p>
-            <w:pPr>
-              <w:spacing w:after="80"/>
-            </w:pPr>
-            <w:r>
-              <w:t xml:space="preserve">11</w:t>
-            </w:r>
-          </w:p>
-        </w:tc>
-        <w:tc>
-          <w:tcPr>
-            <w:tcW w:type="dxa" w:w="4559"/>
-            <w:tcBorders>
-              <w:top w:val="single" w:color="D9D2CA" w:sz="4"/>
-              <w:left w:val="single" w:color="D9D2CA" w:sz="4"/>
-              <w:bottom w:val="single" w:color="D9D2CA" w:sz="4"/>
-              <w:right w:val="single" w:color="D9D2CA" w:sz="4"/>
-            </w:tcBorders>
-            <w:tcMar>
-              <w:top w:type="dxa" w:w="80"/>
-              <w:left w:type="dxa" w:w="120"/>
-              <w:bottom w:type="dxa" w:w="80"/>
-              <w:right w:type="dxa" w:w="120"/>
-            </w:tcMar>
-          </w:tcPr>
-          <w:p>
-            <w:pPr>
-              <w:spacing w:after="80"/>
-            </w:pPr>
-            <w:r>
-              <w:t xml:space="preserve">Notre rituel tête-à-tête : à quelle fréquence, sous quelle forme ?</w:t>
-            </w:r>
-          </w:p>
-        </w:tc>
-        <w:tc>
-          <w:tcPr>
-            <w:tcW w:type="dxa" w:w="4559"/>
-            <w:tcBorders>
-              <w:top w:val="single" w:color="D9D2CA" w:sz="4"/>
-              <w:left w:val="single" w:color="D9D2CA" w:sz="4"/>
-              <w:bottom w:val="single" w:color="D9D2CA" w:sz="4"/>
-              <w:right w:val="single" w:color="D9D2CA" w:sz="4"/>
-            </w:tcBorders>
-            <w:tcMar>
-              <w:top w:type="dxa" w:w="80"/>
-              <w:left w:type="dxa" w:w="120"/>
-              <w:bottom w:type="dxa" w:w="80"/>
-              <w:right w:type="dxa" w:w="120"/>
-            </w:tcMar>
-          </w:tcPr>
-          <w:p>
-            <w:pPr>
-              <w:spacing w:after="80"/>
-            </w:pPr>
-            <w:r>
-              <w:t xml:space="preserve">Our one-on-one ritual: how often, in what form?</w:t>
-            </w:r>
-          </w:p>
-        </w:tc>
-      </w:tr>
-      <w:tr>
-        <w:trPr>
-          <w:cantSplit w:val="false"/>
-        </w:trPr>
-        <w:tc>
-          <w:tcPr>
-            <w:tcW w:type="dxa" w:w="520"/>
-            <w:tcBorders>
-              <w:top w:val="single" w:color="D9D2CA" w:sz="4"/>
-              <w:left w:val="single" w:color="D9D2CA" w:sz="4"/>
-              <w:bottom w:val="single" w:color="D9D2CA" w:sz="4"/>
-              <w:right w:val="single" w:color="D9D2CA" w:sz="4"/>
-            </w:tcBorders>
-            <w:shd w:fill="FBF8F3" w:color="auto" w:val="clear"/>
-            <w:tcMar>
-              <w:top w:type="dxa" w:w="80"/>
-              <w:left w:type="dxa" w:w="120"/>
-              <w:bottom w:type="dxa" w:w="80"/>
-              <w:right w:type="dxa" w:w="120"/>
-            </w:tcMar>
-          </w:tcPr>
-          <w:p>
-            <w:pPr>
-              <w:spacing w:after="80"/>
-            </w:pPr>
-            <w:r>
-              <w:t xml:space="preserve">12</w:t>
-            </w:r>
-          </w:p>
-        </w:tc>
-        <w:tc>
-          <w:tcPr>
-            <w:tcW w:type="dxa" w:w="4559"/>
-            <w:tcBorders>
-              <w:top w:val="single" w:color="D9D2CA" w:sz="4"/>
-              <w:left w:val="single" w:color="D9D2CA" w:sz="4"/>
-              <w:bottom w:val="single" w:color="D9D2CA" w:sz="4"/>
-              <w:right w:val="single" w:color="D9D2CA" w:sz="4"/>
-            </w:tcBorders>
-            <w:shd w:fill="FBF8F3" w:color="auto" w:val="clear"/>
-            <w:tcMar>
-              <w:top w:type="dxa" w:w="80"/>
-              <w:left w:type="dxa" w:w="120"/>
-              <w:bottom w:type="dxa" w:w="80"/>
-              <w:right w:type="dxa" w:w="120"/>
-            </w:tcMar>
-          </w:tcPr>
-          <w:p>
-            <w:pPr>
-              <w:spacing w:after="80"/>
-            </w:pPr>
-            <w:r>
-              <w:t xml:space="preserve">Tes engagements personnels — Une chose que je m'engage à faire pour toi cette année. Et une chose à laquelle je renonce, ou que je m'engage à faire moins.</w:t>
-            </w:r>
-          </w:p>
-        </w:tc>
-        <w:tc>
-          <w:tcPr>
-            <w:tcW w:type="dxa" w:w="4559"/>
-            <w:tcBorders>
-              <w:top w:val="single" w:color="D9D2CA" w:sz="4"/>
-              <w:left w:val="single" w:color="D9D2CA" w:sz="4"/>
-              <w:bottom w:val="single" w:color="D9D2CA" w:sz="4"/>
-              <w:right w:val="single" w:color="D9D2CA" w:sz="4"/>
-            </w:tcBorders>
-            <w:shd w:fill="FBF8F3" w:color="auto" w:val="clear"/>
-            <w:tcMar>
-              <w:top w:type="dxa" w:w="80"/>
-              <w:left w:type="dxa" w:w="120"/>
-              <w:bottom w:type="dxa" w:w="80"/>
-              <w:right w:type="dxa" w:w="120"/>
-            </w:tcMar>
-          </w:tcPr>
-          <w:p>
-            <w:pPr>
-              <w:spacing w:after="80"/>
-            </w:pPr>
-            <w:r>
-              <w:t xml:space="preserve">Your personal commitments — One thing I commit to doing for you this year. And one thing I give up, or commit to doing less.</w:t>
-            </w:r>
-          </w:p>
-        </w:tc>
-      </w:tr>
-      <w:tr>
-        <w:trPr>
-          <w:cantSplit w:val="false"/>
-        </w:trPr>
-        <w:tc>
-          <w:tcPr>
-            <w:tcW w:type="dxa" w:w="520"/>
-            <w:tcBorders>
-              <w:top w:val="single" w:color="D9D2CA" w:sz="4"/>
-              <w:left w:val="single" w:color="D9D2CA" w:sz="4"/>
-              <w:bottom w:val="single" w:color="D9D2CA" w:sz="4"/>
-              <w:right w:val="single" w:color="D9D2CA" w:sz="4"/>
-            </w:tcBorders>
-            <w:tcMar>
-              <w:top w:type="dxa" w:w="80"/>
-              <w:left w:type="dxa" w:w="120"/>
-              <w:bottom w:type="dxa" w:w="80"/>
-              <w:right w:type="dxa" w:w="120"/>
-            </w:tcMar>
-          </w:tcPr>
-          <w:p>
-            <w:pPr>
-              <w:spacing w:after="80"/>
-            </w:pPr>
-            <w:r>
-              <w:t xml:space="preserve">13</w:t>
-            </w:r>
-          </w:p>
-        </w:tc>
-        <w:tc>
-          <w:tcPr>
-            <w:tcW w:type="dxa" w:w="4559"/>
-            <w:tcBorders>
-              <w:top w:val="single" w:color="D9D2CA" w:sz="4"/>
-              <w:left w:val="single" w:color="D9D2CA" w:sz="4"/>
-              <w:bottom w:val="single" w:color="D9D2CA" w:sz="4"/>
-              <w:right w:val="single" w:color="D9D2CA" w:sz="4"/>
-            </w:tcBorders>
-            <w:tcMar>
-              <w:top w:type="dxa" w:w="80"/>
-              <w:left w:type="dxa" w:w="120"/>
-              <w:bottom w:type="dxa" w:w="80"/>
-              <w:right w:type="dxa" w:w="120"/>
-            </w:tcMar>
-          </w:tcPr>
-          <w:p>
-            <w:pPr>
-              <w:spacing w:after="80"/>
-            </w:pPr>
-            <w:r>
-              <w:t xml:space="preserve">Ce que j'aimerais recevoir de toi cette année.</w:t>
-            </w:r>
-          </w:p>
-        </w:tc>
-        <w:tc>
-          <w:tcPr>
-            <w:tcW w:type="dxa" w:w="4559"/>
-            <w:tcBorders>
-              <w:top w:val="single" w:color="D9D2CA" w:sz="4"/>
-              <w:left w:val="single" w:color="D9D2CA" w:sz="4"/>
-              <w:bottom w:val="single" w:color="D9D2CA" w:sz="4"/>
-              <w:right w:val="single" w:color="D9D2CA" w:sz="4"/>
-            </w:tcBorders>
-            <w:tcMar>
-              <w:top w:type="dxa" w:w="80"/>
-              <w:left w:type="dxa" w:w="120"/>
-              <w:bottom w:type="dxa" w:w="80"/>
-              <w:right w:type="dxa" w:w="120"/>
-            </w:tcMar>
-          </w:tcPr>
-          <w:p>
-            <w:pPr>
-              <w:spacing w:after="80"/>
-            </w:pPr>
-            <w:r>
-              <w:t xml:space="preserve">What I would like to receive from you this year.</w:t>
-            </w:r>
-          </w:p>
-        </w:tc>
-      </w:tr>
-      <w:tr>
-        <w:trPr>
-          <w:cantSplit w:val="false"/>
-        </w:trPr>
-        <w:tc>
-          <w:tcPr>
-            <w:tcW w:type="dxa" w:w="520"/>
-            <w:tcBorders>
-              <w:top w:val="single" w:color="D9D2CA" w:sz="4"/>
-              <w:left w:val="single" w:color="D9D2CA" w:sz="4"/>
-              <w:bottom w:val="single" w:color="D9D2CA" w:sz="4"/>
-              <w:right w:val="single" w:color="D9D2CA" w:sz="4"/>
-            </w:tcBorders>
-            <w:shd w:fill="FBF8F3" w:color="auto" w:val="clear"/>
-            <w:tcMar>
-              <w:top w:type="dxa" w:w="80"/>
-              <w:left w:type="dxa" w:w="120"/>
-              <w:bottom w:type="dxa" w:w="80"/>
-              <w:right w:type="dxa" w:w="120"/>
-            </w:tcMar>
-          </w:tcPr>
-          <w:p>
-            <w:pPr>
-              <w:spacing w:after="80"/>
-            </w:pPr>
-            <w:r>
-              <w:t xml:space="preserve">14</w:t>
-            </w:r>
-          </w:p>
-        </w:tc>
-        <w:tc>
-          <w:tcPr>
-            <w:tcW w:type="dxa" w:w="4559"/>
-            <w:tcBorders>
-              <w:top w:val="single" w:color="D9D2CA" w:sz="4"/>
-              <w:left w:val="single" w:color="D9D2CA" w:sz="4"/>
-              <w:bottom w:val="single" w:color="D9D2CA" w:sz="4"/>
-              <w:right w:val="single" w:color="D9D2CA" w:sz="4"/>
-            </w:tcBorders>
-            <w:shd w:fill="FBF8F3" w:color="auto" w:val="clear"/>
-            <w:tcMar>
-              <w:top w:type="dxa" w:w="80"/>
-              <w:left w:type="dxa" w:w="120"/>
-              <w:bottom w:type="dxa" w:w="80"/>
-              <w:right w:type="dxa" w:w="120"/>
-            </w:tcMar>
-          </w:tcPr>
-          <w:p>
-            <w:pPr>
-              <w:spacing w:after="80"/>
-            </w:pPr>
-            <w:r>
-              <w:t xml:space="preserve">Projette-toi dans un an, le jour de votre rendez-vous annuel : à quoi ressemblera une année réussie pour votre couple ? Qu'est-ce qui te ferait dire « c'était une belle année » ?</w:t>
-            </w:r>
-          </w:p>
-        </w:tc>
-        <w:tc>
-          <w:tcPr>
-            <w:tcW w:type="dxa" w:w="4559"/>
-            <w:tcBorders>
-              <w:top w:val="single" w:color="D9D2CA" w:sz="4"/>
-              <w:left w:val="single" w:color="D9D2CA" w:sz="4"/>
-              <w:bottom w:val="single" w:color="D9D2CA" w:sz="4"/>
-              <w:right w:val="single" w:color="D9D2CA" w:sz="4"/>
-            </w:tcBorders>
-            <w:shd w:fill="FBF8F3" w:color="auto" w:val="clear"/>
-            <w:tcMar>
-              <w:top w:type="dxa" w:w="80"/>
-              <w:left w:type="dxa" w:w="120"/>
-              <w:bottom w:type="dxa" w:w="80"/>
-              <w:right w:type="dxa" w:w="120"/>
-            </w:tcMar>
-          </w:tcPr>
-          <w:p>
-            <w:pPr>
-              <w:spacing w:after="80"/>
-            </w:pPr>
-            <w:r>
-              <w:t xml:space="preserve">Picture yourself a year from now, on the day of your yearly date: what will a successful year look like for your relationship? What would make you say "it was a great year"?</w:t>
-            </w:r>
-          </w:p>
-        </w:tc>
-      </w:tr>
-      <w:tr>
-        <w:trPr>
-          <w:cantSplit w:val="false"/>
-        </w:trPr>
-        <w:tc>
-          <w:tcPr>
-            <w:tcW w:type="dxa" w:w="520"/>
-            <w:tcBorders>
-              <w:top w:val="single" w:color="D9D2CA" w:sz="4"/>
-              <w:left w:val="single" w:color="D9D2CA" w:sz="4"/>
-              <w:bottom w:val="single" w:color="D9D2CA" w:sz="4"/>
-              <w:right w:val="single" w:color="D9D2CA" w:sz="4"/>
-            </w:tcBorders>
-            <w:tcMar>
-              <w:top w:type="dxa" w:w="80"/>
-              <w:left w:type="dxa" w:w="120"/>
-              <w:bottom w:type="dxa" w:w="80"/>
-              <w:right w:type="dxa" w:w="120"/>
-            </w:tcMar>
-          </w:tcPr>
-          <w:p>
-            <w:pPr>
-              <w:spacing w:after="80"/>
-            </w:pPr>
-            <w:r>
-              <w:t xml:space="preserve">15</w:t>
-            </w:r>
-          </w:p>
-        </w:tc>
-        <w:tc>
-          <w:tcPr>
-            <w:tcW w:type="dxa" w:w="4559"/>
-            <w:tcBorders>
-              <w:top w:val="single" w:color="D9D2CA" w:sz="4"/>
-              <w:left w:val="single" w:color="D9D2CA" w:sz="4"/>
-              <w:bottom w:val="single" w:color="D9D2CA" w:sz="4"/>
-              <w:right w:val="single" w:color="D9D2CA" w:sz="4"/>
-            </w:tcBorders>
-            <w:tcMar>
-              <w:top w:type="dxa" w:w="80"/>
-              <w:left w:type="dxa" w:w="120"/>
-              <w:bottom w:type="dxa" w:w="80"/>
-              <w:right w:type="dxa" w:w="120"/>
-            </w:tcMar>
-          </w:tcPr>
-          <w:p>
-            <w:pPr>
-              <w:spacing w:after="80"/>
-            </w:pPr>
-            <w:r>
-              <w:t xml:space="preserve">Sceller le pacte — En une phrase, ta promesse à l'autre pour l'année à venir.</w:t>
-            </w:r>
-          </w:p>
-        </w:tc>
-        <w:tc>
-          <w:tcPr>
-            <w:tcW w:type="dxa" w:w="4559"/>
-            <w:tcBorders>
-              <w:top w:val="single" w:color="D9D2CA" w:sz="4"/>
-              <w:left w:val="single" w:color="D9D2CA" w:sz="4"/>
-              <w:bottom w:val="single" w:color="D9D2CA" w:sz="4"/>
-              <w:right w:val="single" w:color="D9D2CA" w:sz="4"/>
-            </w:tcBorders>
-            <w:tcMar>
-              <w:top w:type="dxa" w:w="80"/>
-              <w:left w:type="dxa" w:w="120"/>
-              <w:bottom w:type="dxa" w:w="80"/>
-              <w:right w:type="dxa" w:w="120"/>
-            </w:tcMar>
-          </w:tcPr>
-          <w:p>
-            <w:pPr>
-              <w:spacing w:after="80"/>
-            </w:pPr>
-            <w:r>
-              <w:t xml:space="preserve">Sealing the pact — In one sentence, your promise to your partner for the year ahead.</w:t>
+              <w:t>Projette-toi dans un an, le jour de votre rendez-vous annuel : à quoi ressemblera une année réussie pour votre couple ?</w:t>
+            </w:r>
+          </w:p>
+        </w:tc>
+        <w:tc>
+          <w:tcPr>
+            <w:tcW w:type="dxa" w:w="4559"/>
+            <w:tcBorders>
+              <w:top w:val="single" w:color="D9D2CA" w:sz="4"/>
+              <w:left w:val="single" w:color="D9D2CA" w:sz="4"/>
+              <w:bottom w:val="single" w:color="D9D2CA" w:sz="4"/>
+              <w:right w:val="single" w:color="D9D2CA" w:sz="4"/>
+            </w:tcBorders>
+            <w:shd w:fill="FBF8F3" w:color="auto" w:val="clear"/>
+            <w:tcMar>
+              <w:top w:type="dxa" w:w="80"/>
+              <w:left w:type="dxa" w:w="120"/>
+              <w:bottom w:type="dxa" w:w="80"/>
+              <w:right w:type="dxa" w:w="120"/>
+            </w:tcMar>
+          </w:tcPr>
+          <w:p>
+            <w:pPr>
+              <w:spacing w:after="80"/>
+            </w:pPr>
+            <w:r>
+              <w:t>Picture yourself a year from now, on the day of your yearly date: what will a successful year look like for your relationship?</w:t>
             </w:r>
           </w:p>
         </w:tc>
@@ -13571,7 +13177,9 @@
               <w:spacing w:after="80"/>
             </w:pPr>
             <w:r>
-              <w:t xml:space="preserve">Notre rendez-vous annuel de couple : à quelle date aimerais-tu le fixer ?</w:t>
+              <w:t>Notre rendez-vous annuel de couple : à quelle date voulez-vous le fixer ?</w:t>
+              <w:br/>
+              <w:t>Vous pouvez par exemple opter pour une date internationale comme la Saint-Valentin. Vous pouvez aussi choisir une date qui vous appartient : un anniversaire de rencontre, de mariage… ou encore simplement vous donner rendez-vous dans un an. Attention à laisser au moins 6 mois (et au plus 1 an) entre la fin du programme et la date du rendez-vous annuel.</w:t>
             </w:r>
           </w:p>
           <w:p>
@@ -13611,7 +13219,7 @@
               <w:spacing w:after="80"/>
             </w:pPr>
             <w:r>
-              <w:t xml:space="preserve">Our yearly couple date: when would you like to set it?</w:t>
+              <w:t>Our yearly couple date: when do you want to set it?</w:t>
             </w:r>
           </w:p>
           <w:p>

</xml_diff>